<commit_message>
Documentacion: actualizacion tipo de dato tabla 3
</commit_message>
<xml_diff>
--- a/DOCUMENTACION/documentacion_proyecto1_BD_LuisDiego.docx
+++ b/DOCUMENTACION/documentacion_proyecto1_BD_LuisDiego.docx
@@ -577,8 +577,13 @@
           <w:numId w:val="4"/>
         </w:numPr>
       </w:pPr>
-      <w:r>
-        <w:t>Id_ubicacion (PK)</w:t>
+      <w:proofErr w:type="spellStart"/>
+      <w:r>
+        <w:t>Id_ubicacion</w:t>
+      </w:r>
+      <w:proofErr w:type="spellEnd"/>
+      <w:r>
+        <w:t xml:space="preserve"> (PK)</w:t>
       </w:r>
     </w:p>
     <w:p>
@@ -646,7 +651,15 @@
         <w:t xml:space="preserve"> una </w:t>
       </w:r>
       <w:r>
-        <w:t>FK =id_ubicacion, que refere</w:t>
+        <w:t>FK =</w:t>
+      </w:r>
+      <w:proofErr w:type="spellStart"/>
+      <w:r>
+        <w:t>id_ubicacion</w:t>
+      </w:r>
+      <w:proofErr w:type="spellEnd"/>
+      <w:r>
+        <w:t>, que refere</w:t>
       </w:r>
       <w:r>
         <w:t>ncia justamente a la llave primaria de la entidad/</w:t>
@@ -679,7 +692,15 @@
     <w:p>
       <w:r>
         <w:lastRenderedPageBreak/>
-        <w:t>Esto haría que UBICACIÓN-EVENTOS tenga cardinalidad 1:N, pues una ubicación se puede relacionar con varios eventos, mientras que un evento solo se refiere a una única ubicación.</w:t>
+        <w:t xml:space="preserve">Esto haría que UBICACIÓN-EVENTOS tenga cardinalidad </w:t>
+      </w:r>
+      <w:proofErr w:type="gramStart"/>
+      <w:r>
+        <w:t>1:N</w:t>
+      </w:r>
+      <w:proofErr w:type="gramEnd"/>
+      <w:r>
+        <w:t>, pues una ubicación se puede relacionar con varios eventos, mientras que un evento solo se refiere a una única ubicación.</w:t>
       </w:r>
     </w:p>
     <w:p/>
@@ -776,8 +797,13 @@
           <w:numId w:val="4"/>
         </w:numPr>
       </w:pPr>
-      <w:r>
-        <w:t>id_serie: PK</w:t>
+      <w:proofErr w:type="spellStart"/>
+      <w:r>
+        <w:t>id_serie</w:t>
+      </w:r>
+      <w:proofErr w:type="spellEnd"/>
+      <w:r>
+        <w:t>: PK</w:t>
       </w:r>
     </w:p>
     <w:p>
@@ -788,9 +814,11 @@
           <w:numId w:val="4"/>
         </w:numPr>
       </w:pPr>
+      <w:proofErr w:type="spellStart"/>
       <w:r>
         <w:t>fecha_inicio</w:t>
       </w:r>
+      <w:proofErr w:type="spellEnd"/>
     </w:p>
     <w:p>
       <w:pPr>
@@ -800,9 +828,11 @@
           <w:numId w:val="4"/>
         </w:numPr>
       </w:pPr>
+      <w:proofErr w:type="spellStart"/>
       <w:r>
         <w:t>fecha_fin</w:t>
       </w:r>
+      <w:proofErr w:type="spellEnd"/>
     </w:p>
     <w:p>
       <w:pPr>
@@ -812,8 +842,29 @@
           <w:numId w:val="4"/>
         </w:numPr>
       </w:pPr>
-      <w:r>
-        <w:t>reglas_patrones_periodicidad-&gt;se divide en 3 sub-atributos. Tenemos “clase_periodicidad”, el cual nos indica si el evento se repite diaria, semanal o mensualmente</w:t>
+      <w:proofErr w:type="spellStart"/>
+      <w:r>
+        <w:t>reglas_patrones_periodicidad</w:t>
+      </w:r>
+      <w:proofErr w:type="spellEnd"/>
+      <w:r>
+        <w:t xml:space="preserve">-&gt;se divide en 3 </w:t>
+      </w:r>
+      <w:proofErr w:type="spellStart"/>
+      <w:r>
+        <w:t>sub-atributos</w:t>
+      </w:r>
+      <w:proofErr w:type="spellEnd"/>
+      <w:r>
+        <w:t>. Tenemos “</w:t>
+      </w:r>
+      <w:proofErr w:type="spellStart"/>
+      <w:r>
+        <w:t>clase_periodicidad</w:t>
+      </w:r>
+      <w:proofErr w:type="spellEnd"/>
+      <w:r>
+        <w:t>”, el cual nos indica si el evento se repite diaria, semanal o mensualmente</w:t>
       </w:r>
       <w:r>
         <w:t xml:space="preserve"> o personalizado</w:t>
@@ -831,7 +882,15 @@
         <w:t xml:space="preserve"> opciones</w:t>
       </w:r>
       <w:r>
-        <w:t xml:space="preserve">). Luego contamos con “intervalo_en_dias_evento” el cual refleja cada cuanto </w:t>
+        <w:t>). Luego contamos con “</w:t>
+      </w:r>
+      <w:proofErr w:type="spellStart"/>
+      <w:r>
+        <w:t>intervalo_en_dias_evento</w:t>
+      </w:r>
+      <w:proofErr w:type="spellEnd"/>
+      <w:r>
+        <w:t xml:space="preserve">” el cual refleja cada cuanto </w:t>
       </w:r>
       <w:r>
         <w:t>se repite el evento, en caso de elegir que se repita de manera personalizada el evento.</w:t>
@@ -847,7 +906,15 @@
         <w:pStyle w:val="Prrafodelista"/>
       </w:pPr>
       <w:r>
-        <w:t xml:space="preserve"> Esto quiere decir que el atributo “intervalo_en_dias_evento” es NULO en caso de que se elija una clase de periodicidad distinta a ‘personalizado’, en caso contrario, se llenan ambos campos de los atributos, el primer atributo tendría un registro= ‘personalizado’ y el otro atributo tendría el intervalo en X días de repetición.</w:t>
+        <w:t xml:space="preserve"> Esto quiere decir que el atributo “</w:t>
+      </w:r>
+      <w:proofErr w:type="spellStart"/>
+      <w:r>
+        <w:t>intervalo_en_dias_evento</w:t>
+      </w:r>
+      <w:proofErr w:type="spellEnd"/>
+      <w:r>
+        <w:t>” es NULO en caso de que se elija una clase de periodicidad distinta a ‘personalizado’, en caso contrario, se llenan ambos campos de los atributos, el primer atributo tendría un registro= ‘personalizado’ y el otro atributo tendría el intervalo en X días de repetición.</w:t>
       </w:r>
     </w:p>
     <w:p>
@@ -860,7 +927,15 @@
         <w:pStyle w:val="Prrafodelista"/>
       </w:pPr>
       <w:r>
-        <w:t>Y por último tendría un atributo llamado “titulo_en_pantalla” esto es para darle algo más descriptivo a la serie del evento.</w:t>
+        <w:t>Y por último tendría un atributo llamado “</w:t>
+      </w:r>
+      <w:proofErr w:type="spellStart"/>
+      <w:r>
+        <w:t>titulo_en_pantalla</w:t>
+      </w:r>
+      <w:proofErr w:type="spellEnd"/>
+      <w:r>
+        <w:t>” esto es para darle algo más descriptivo a la serie del evento.</w:t>
       </w:r>
     </w:p>
     <w:p>
@@ -963,7 +1038,15 @@
     <w:p/>
     <w:p>
       <w:r>
-        <w:t>Este modulo cuenta como tal con la siguiente entidad con sus atributos:</w:t>
+        <w:t xml:space="preserve">Este </w:t>
+      </w:r>
+      <w:proofErr w:type="spellStart"/>
+      <w:r>
+        <w:t>modulo</w:t>
+      </w:r>
+      <w:proofErr w:type="spellEnd"/>
+      <w:r>
+        <w:t xml:space="preserve"> cuenta como tal con la siguiente entidad con sus atributos:</w:t>
       </w:r>
     </w:p>
     <w:p>
@@ -986,9 +1069,11 @@
           <w:numId w:val="4"/>
         </w:numPr>
       </w:pPr>
+      <w:proofErr w:type="spellStart"/>
       <w:r>
         <w:t>id_tarea:PK</w:t>
       </w:r>
+      <w:proofErr w:type="spellEnd"/>
     </w:p>
     <w:p>
       <w:pPr>
@@ -1034,9 +1119,11 @@
           <w:numId w:val="4"/>
         </w:numPr>
       </w:pPr>
+      <w:proofErr w:type="spellStart"/>
       <w:r>
         <w:t>fecha_limite</w:t>
       </w:r>
+      <w:proofErr w:type="spellEnd"/>
     </w:p>
     <w:p>
       <w:pPr>
@@ -1135,7 +1222,15 @@
     </w:p>
     <w:p>
       <w:r>
-        <w:t>Después de pensar de que manera se unen de manera más natural todos los elementos de los diagramas realizados + el brindado, la propuesta cumple con la lógica y también reglas de negocio.</w:t>
+        <w:t xml:space="preserve">Después de pensar de </w:t>
+      </w:r>
+      <w:proofErr w:type="spellStart"/>
+      <w:r>
+        <w:t>que</w:t>
+      </w:r>
+      <w:proofErr w:type="spellEnd"/>
+      <w:r>
+        <w:t xml:space="preserve"> manera se unen de manera más natural todos los elementos de los diagramas realizados + el brindado, la propuesta cumple con la lógica y también reglas de negocio.</w:t>
       </w:r>
     </w:p>
     <w:p/>
@@ -1223,7 +1318,15 @@
     </w:p>
     <w:p>
       <w:r>
-        <w:t xml:space="preserve">Una ves completado toda la parte conceptual y visual para comprender de una manera más simplificada los problemas presentados, pues podemos convertir las nuevas entidades con sus atributos y relaciones en Tablas y presentar las tablas de las entidades </w:t>
+        <w:t xml:space="preserve">Una </w:t>
+      </w:r>
+      <w:proofErr w:type="spellStart"/>
+      <w:r>
+        <w:t>ves</w:t>
+      </w:r>
+      <w:proofErr w:type="spellEnd"/>
+      <w:r>
+        <w:t xml:space="preserve"> completado toda la parte conceptual y visual para comprender de una manera más simplificada los problemas presentados, pues podemos convertir las nuevas entidades con sus atributos y relaciones en Tablas y presentar las tablas de las entidades </w:t>
       </w:r>
       <w:r>
         <w:t>modificadas,</w:t>
@@ -1232,7 +1335,15 @@
         <w:t xml:space="preserve"> en base al modelo lógico visto en el curso</w:t>
       </w:r>
       <w:r>
-        <w:t>, el cuál se presenta de la siguiente manera:</w:t>
+        <w:t xml:space="preserve">, el </w:t>
+      </w:r>
+      <w:proofErr w:type="spellStart"/>
+      <w:r>
+        <w:t>cuál</w:t>
+      </w:r>
+      <w:proofErr w:type="spellEnd"/>
+      <w:r>
+        <w:t xml:space="preserve"> se presenta de la siguiente manera:</w:t>
       </w:r>
     </w:p>
     <w:p/>
@@ -1250,6 +1361,7 @@
       <w:r>
         <w:t xml:space="preserve"> (</w:t>
       </w:r>
+      <w:proofErr w:type="spellStart"/>
       <w:r>
         <w:rPr>
           <w:u w:val="single"/>
@@ -1262,11 +1374,20 @@
         </w:rPr>
         <w:t>ubicacion</w:t>
       </w:r>
+      <w:proofErr w:type="spellEnd"/>
       <w:r>
         <w:t xml:space="preserve"> [</w:t>
       </w:r>
       <w:r>
-        <w:t>PK], nombre, ciudad, direccion, capacidad)</w:t>
+        <w:t xml:space="preserve">PK], nombre, ciudad, </w:t>
+      </w:r>
+      <w:proofErr w:type="spellStart"/>
+      <w:r>
+        <w:t>direccion</w:t>
+      </w:r>
+      <w:proofErr w:type="spellEnd"/>
+      <w:r>
+        <w:t>, capacidad)</w:t>
       </w:r>
     </w:p>
     <w:p>
@@ -1280,6 +1401,7 @@
       <w:r>
         <w:t>SERIES_EVENTOS (</w:t>
       </w:r>
+      <w:proofErr w:type="spellStart"/>
       <w:r>
         <w:rPr>
           <w:u w:val="single"/>
@@ -1292,17 +1414,74 @@
         </w:rPr>
         <w:t>serie</w:t>
       </w:r>
+      <w:proofErr w:type="spellEnd"/>
       <w:r>
         <w:t xml:space="preserve"> [</w:t>
       </w:r>
       <w:r>
-        <w:t>PK], id_usuario_</w:t>
-      </w:r>
-      <w:r>
-        <w:t>propietario [</w:t>
-      </w:r>
-      <w:r>
-        <w:t>FK], titulo_serie, fecha_inicio, fecha_fin, clase_periodicidad, intervalo_en_dias_evento, reserva_dias_especifios_eventos)</w:t>
+        <w:t xml:space="preserve">PK], </w:t>
+      </w:r>
+      <w:proofErr w:type="spellStart"/>
+      <w:r>
+        <w:t>id_usuario_</w:t>
+      </w:r>
+      <w:r>
+        <w:t>propietario</w:t>
+      </w:r>
+      <w:proofErr w:type="spellEnd"/>
+      <w:r>
+        <w:t xml:space="preserve"> [</w:t>
+      </w:r>
+      <w:r>
+        <w:t xml:space="preserve">FK], </w:t>
+      </w:r>
+      <w:proofErr w:type="spellStart"/>
+      <w:r>
+        <w:t>titulo_serie</w:t>
+      </w:r>
+      <w:proofErr w:type="spellEnd"/>
+      <w:r>
+        <w:t xml:space="preserve">, </w:t>
+      </w:r>
+      <w:proofErr w:type="spellStart"/>
+      <w:r>
+        <w:t>fecha_inicio</w:t>
+      </w:r>
+      <w:proofErr w:type="spellEnd"/>
+      <w:r>
+        <w:t xml:space="preserve">, </w:t>
+      </w:r>
+      <w:proofErr w:type="spellStart"/>
+      <w:r>
+        <w:t>fecha_fin</w:t>
+      </w:r>
+      <w:proofErr w:type="spellEnd"/>
+      <w:r>
+        <w:t xml:space="preserve">, </w:t>
+      </w:r>
+      <w:proofErr w:type="spellStart"/>
+      <w:r>
+        <w:t>clase_periodicidad</w:t>
+      </w:r>
+      <w:proofErr w:type="spellEnd"/>
+      <w:r>
+        <w:t xml:space="preserve">, </w:t>
+      </w:r>
+      <w:proofErr w:type="spellStart"/>
+      <w:r>
+        <w:t>intervalo_en_dias_evento</w:t>
+      </w:r>
+      <w:proofErr w:type="spellEnd"/>
+      <w:r>
+        <w:t xml:space="preserve">, </w:t>
+      </w:r>
+      <w:proofErr w:type="spellStart"/>
+      <w:r>
+        <w:t>reserva_dias_especifios_eventos</w:t>
+      </w:r>
+      <w:proofErr w:type="spellEnd"/>
+      <w:r>
+        <w:t>)</w:t>
       </w:r>
     </w:p>
     <w:p>
@@ -1351,19 +1530,75 @@
         <w:rPr>
           <w:highlight w:val="cyan"/>
         </w:rPr>
-        <w:t>NOTA 2: En esta tabla se pueden dar ciertos casos como los siguientes: ‘reserva_dias_especificos’ será nulo, solo en caso de que ‘clase periodicidad’ se agregue como ‘personalizado’</w:t>
-      </w:r>
+        <w:t>NOTA 2: En esta tabla se pueden dar ciertos casos como los siguientes: ‘</w:t>
+      </w:r>
+      <w:proofErr w:type="spellStart"/>
       <w:r>
         <w:rPr>
           <w:highlight w:val="cyan"/>
         </w:rPr>
-        <w:t>. El otro caso es en el que ´reserva_dias_especificos’ puede ser Nulo debido a que ‘clase_periodicidad’ es semanal</w:t>
-      </w:r>
+        <w:t>reserva_dias_especificos</w:t>
+      </w:r>
+      <w:proofErr w:type="spellEnd"/>
       <w:r>
         <w:rPr>
           <w:highlight w:val="cyan"/>
         </w:rPr>
-        <w:t>, pero si las ocurrencias son semanales, pero por ejemplo con 2 dias a la semana, ahí si se deben agregar.</w:t>
+        <w:t>’ será nulo, solo en caso de que ‘clase periodicidad’ se agregue como ‘personalizado’</w:t>
+      </w:r>
+      <w:r>
+        <w:rPr>
+          <w:highlight w:val="cyan"/>
+        </w:rPr>
+        <w:t>. El otro caso es en el que ´</w:t>
+      </w:r>
+      <w:proofErr w:type="spellStart"/>
+      <w:r>
+        <w:rPr>
+          <w:highlight w:val="cyan"/>
+        </w:rPr>
+        <w:t>reserva_dias_especificos</w:t>
+      </w:r>
+      <w:proofErr w:type="spellEnd"/>
+      <w:r>
+        <w:rPr>
+          <w:highlight w:val="cyan"/>
+        </w:rPr>
+        <w:t>’ puede ser Nulo debido a que ‘</w:t>
+      </w:r>
+      <w:proofErr w:type="spellStart"/>
+      <w:r>
+        <w:rPr>
+          <w:highlight w:val="cyan"/>
+        </w:rPr>
+        <w:t>clase_periodicidad</w:t>
+      </w:r>
+      <w:proofErr w:type="spellEnd"/>
+      <w:r>
+        <w:rPr>
+          <w:highlight w:val="cyan"/>
+        </w:rPr>
+        <w:t>’ es semanal</w:t>
+      </w:r>
+      <w:r>
+        <w:rPr>
+          <w:highlight w:val="cyan"/>
+        </w:rPr>
+        <w:t xml:space="preserve">, pero si las ocurrencias son semanales, pero por ejemplo con 2 </w:t>
+      </w:r>
+      <w:proofErr w:type="spellStart"/>
+      <w:r>
+        <w:rPr>
+          <w:highlight w:val="cyan"/>
+        </w:rPr>
+        <w:t>dias</w:t>
+      </w:r>
+      <w:proofErr w:type="spellEnd"/>
+      <w:r>
+        <w:rPr>
+          <w:highlight w:val="cyan"/>
+        </w:rPr>
+        <w:t xml:space="preserve"> a la semana, ahí si se deben agregar.</w:t>
       </w:r>
     </w:p>
     <w:p>
@@ -1383,24 +1618,117 @@
         </w:numPr>
       </w:pPr>
       <w:r>
-        <w:t xml:space="preserve">TAREAS (id_tarea[PK], id_usuario_a_cargo[FK], </w:t>
-      </w:r>
-      <w:r>
-        <w:t>id_evento[FK],</w:t>
-      </w:r>
-      <w:r>
-        <w:t xml:space="preserve"> titulo, descripción, prioridad, fecha_limite, estado)</w:t>
-      </w:r>
-    </w:p>
-    <w:p>
-      <w:r>
-        <w:t xml:space="preserve">Y por ultimo la tabla modificada </w:t>
+        <w:t>TAREAS (</w:t>
+      </w:r>
+      <w:proofErr w:type="spellStart"/>
+      <w:r>
+        <w:t>id_</w:t>
+      </w:r>
+      <w:proofErr w:type="gramStart"/>
+      <w:r>
+        <w:t>tarea</w:t>
+      </w:r>
+      <w:proofErr w:type="spellEnd"/>
+      <w:r>
+        <w:t>[</w:t>
+      </w:r>
+      <w:proofErr w:type="gramEnd"/>
+      <w:r>
+        <w:t xml:space="preserve">PK], </w:t>
+      </w:r>
+      <w:proofErr w:type="spellStart"/>
+      <w:r>
+        <w:t>id_usuario_a_</w:t>
+      </w:r>
+      <w:proofErr w:type="gramStart"/>
+      <w:r>
+        <w:t>cargo</w:t>
+      </w:r>
+      <w:proofErr w:type="spellEnd"/>
+      <w:r>
+        <w:t>[</w:t>
+      </w:r>
+      <w:proofErr w:type="gramEnd"/>
+      <w:r>
+        <w:t xml:space="preserve">FK], </w:t>
+      </w:r>
+      <w:proofErr w:type="spellStart"/>
+      <w:r>
+        <w:t>id_</w:t>
+      </w:r>
+      <w:proofErr w:type="gramStart"/>
+      <w:r>
+        <w:t>evento</w:t>
+      </w:r>
+      <w:proofErr w:type="spellEnd"/>
+      <w:r>
+        <w:t>[</w:t>
+      </w:r>
+      <w:proofErr w:type="gramEnd"/>
+      <w:r>
+        <w:t>FK],</w:t>
+      </w:r>
+      <w:r>
+        <w:t xml:space="preserve"> titulo, descripción, prioridad, </w:t>
+      </w:r>
+      <w:proofErr w:type="spellStart"/>
+      <w:r>
+        <w:t>fecha_limite</w:t>
+      </w:r>
+      <w:proofErr w:type="spellEnd"/>
+      <w:r>
+        <w:t>, estado)</w:t>
+      </w:r>
+    </w:p>
+    <w:p>
+      <w:r>
+        <w:t xml:space="preserve">Y por </w:t>
+      </w:r>
+      <w:proofErr w:type="spellStart"/>
+      <w:r>
+        <w:t>ultimo</w:t>
+      </w:r>
+      <w:proofErr w:type="spellEnd"/>
+      <w:r>
+        <w:t xml:space="preserve"> la tabla modificada </w:t>
       </w:r>
     </w:p>
     <w:p>
       <w:r>
         <w:lastRenderedPageBreak/>
-        <w:t>EVENTOS (id_ubicacion[FK], id_serie[FK</w:t>
+        <w:t>EVENTOS (</w:t>
+      </w:r>
+      <w:proofErr w:type="spellStart"/>
+      <w:r>
+        <w:t>id_</w:t>
+      </w:r>
+      <w:proofErr w:type="gramStart"/>
+      <w:r>
+        <w:t>ubicacion</w:t>
+      </w:r>
+      <w:proofErr w:type="spellEnd"/>
+      <w:r>
+        <w:t>[</w:t>
+      </w:r>
+      <w:proofErr w:type="gramEnd"/>
+      <w:r>
+        <w:t xml:space="preserve">FK], </w:t>
+      </w:r>
+      <w:proofErr w:type="spellStart"/>
+      <w:r>
+        <w:t>id_</w:t>
+      </w:r>
+      <w:proofErr w:type="gramStart"/>
+      <w:r>
+        <w:t>serie</w:t>
+      </w:r>
+      <w:proofErr w:type="spellEnd"/>
+      <w:r>
+        <w:t>[</w:t>
+      </w:r>
+      <w:proofErr w:type="gramEnd"/>
+      <w:r>
+        <w:t>FK</w:t>
       </w:r>
       <w:r>
         <w:t>]) estos</w:t>
@@ -1437,7 +1765,15 @@
         <w:t>un caso</w:t>
       </w:r>
       <w:r>
-        <w:t xml:space="preserve"> en el que se comparte un teléfono como en una casa, pues entonces por mas q el id de un usuario sea distinto, no lo dejará agregar por ser PK solo teléfono</w:t>
+        <w:t xml:space="preserve"> en el que se comparte un teléfono como en una casa, pues entonces por </w:t>
+      </w:r>
+      <w:proofErr w:type="spellStart"/>
+      <w:r>
+        <w:t>mas</w:t>
+      </w:r>
+      <w:proofErr w:type="spellEnd"/>
+      <w:r>
+        <w:t xml:space="preserve"> q el id de un usuario sea distinto, no lo dejará agregar por ser PK solo teléfono</w:t>
       </w:r>
     </w:p>
     <w:p>
@@ -1525,9 +1861,11 @@
             <w:tcW w:w="4414" w:type="dxa"/>
           </w:tcPr>
           <w:p>
+            <w:proofErr w:type="spellStart"/>
             <w:r>
               <w:t>id_ubicacion</w:t>
             </w:r>
+            <w:proofErr w:type="spellEnd"/>
           </w:p>
         </w:tc>
         <w:tc>
@@ -1612,9 +1950,11 @@
             <w:tcW w:w="4414" w:type="dxa"/>
           </w:tcPr>
           <w:p>
+            <w:proofErr w:type="spellStart"/>
             <w:r>
               <w:t>direccion</w:t>
             </w:r>
+            <w:proofErr w:type="spellEnd"/>
           </w:p>
         </w:tc>
         <w:tc>
@@ -1666,7 +2006,15 @@
         <w:t xml:space="preserve">NOTA: </w:t>
       </w:r>
       <w:r>
-        <w:t>Para capacidad se agregará un check para confirmar que nunca sean negativos sus valores en los registros.</w:t>
+        <w:t xml:space="preserve">Para capacidad se agregará un </w:t>
+      </w:r>
+      <w:proofErr w:type="spellStart"/>
+      <w:r>
+        <w:t>check</w:t>
+      </w:r>
+      <w:proofErr w:type="spellEnd"/>
+      <w:r>
+        <w:t xml:space="preserve"> para confirmar que nunca sean negativos sus valores en los registros.</w:t>
       </w:r>
     </w:p>
     <w:p>
@@ -1675,6 +2023,7 @@
       </w:r>
     </w:p>
     <w:p>
+      <w:proofErr w:type="spellStart"/>
       <w:r>
         <w:rPr>
           <w:b/>
@@ -1683,6 +2032,7 @@
         <w:lastRenderedPageBreak/>
         <w:t>create</w:t>
       </w:r>
+      <w:proofErr w:type="spellEnd"/>
       <w:r>
         <w:t xml:space="preserve"> </w:t>
       </w:r>
@@ -1700,8 +2050,16 @@
     <w:p>
       <w:r>
         <w:tab/>
-        <w:t xml:space="preserve">id_ubicacion SERIAL </w:t>
-      </w:r>
+      </w:r>
+      <w:proofErr w:type="spellStart"/>
+      <w:r>
+        <w:t>id_ubicacion</w:t>
+      </w:r>
+      <w:proofErr w:type="spellEnd"/>
+      <w:r>
+        <w:t xml:space="preserve"> SERIAL </w:t>
+      </w:r>
+      <w:proofErr w:type="spellStart"/>
       <w:r>
         <w:rPr>
           <w:b/>
@@ -1709,9 +2067,11 @@
         </w:rPr>
         <w:t>primary</w:t>
       </w:r>
+      <w:proofErr w:type="spellEnd"/>
       <w:r>
         <w:t xml:space="preserve"> </w:t>
       </w:r>
+      <w:proofErr w:type="spellStart"/>
       <w:r>
         <w:rPr>
           <w:b/>
@@ -1719,6 +2079,7 @@
         </w:rPr>
         <w:t>key</w:t>
       </w:r>
+      <w:proofErr w:type="spellEnd"/>
       <w:r>
         <w:t>,</w:t>
       </w:r>
@@ -1805,6 +2166,8 @@
       <w:r>
         <w:t xml:space="preserve">ciudad </w:t>
       </w:r>
+      <w:proofErr w:type="spellStart"/>
+      <w:proofErr w:type="gramStart"/>
       <w:r>
         <w:rPr>
           <w:b/>
@@ -1812,9 +2175,15 @@
         </w:rPr>
         <w:t>varchar</w:t>
       </w:r>
-      <w:r>
-        <w:t xml:space="preserve">(60) </w:t>
-      </w:r>
+      <w:proofErr w:type="spellEnd"/>
+      <w:r>
+        <w:t>(</w:t>
+      </w:r>
+      <w:proofErr w:type="gramEnd"/>
+      <w:r>
+        <w:t xml:space="preserve">60) </w:t>
+      </w:r>
+      <w:proofErr w:type="spellStart"/>
       <w:r>
         <w:rPr>
           <w:b/>
@@ -1822,9 +2191,11 @@
         </w:rPr>
         <w:t>not</w:t>
       </w:r>
+      <w:proofErr w:type="spellEnd"/>
       <w:r>
         <w:t xml:space="preserve"> </w:t>
       </w:r>
+      <w:proofErr w:type="spellStart"/>
       <w:r>
         <w:rPr>
           <w:b/>
@@ -1832,6 +2203,7 @@
         </w:rPr>
         <w:t>null</w:t>
       </w:r>
+      <w:proofErr w:type="spellEnd"/>
       <w:r>
         <w:t>,</w:t>
       </w:r>
@@ -1839,14 +2211,31 @@
     <w:p>
       <w:r>
         <w:tab/>
-        <w:t>--este atributo no es unico, pues sino no se cumple lo de gestionar varias salas que pueden estar en la misma ciudad</w:t>
+        <w:t xml:space="preserve">--este atributo no es </w:t>
+      </w:r>
+      <w:proofErr w:type="spellStart"/>
+      <w:r>
+        <w:t>unico</w:t>
+      </w:r>
+      <w:proofErr w:type="spellEnd"/>
+      <w:r>
+        <w:t>, pues sino no se cumple lo de gestionar varias salas que pueden estar en la misma ciudad</w:t>
       </w:r>
     </w:p>
     <w:p>
       <w:r>
         <w:tab/>
-        <w:t xml:space="preserve">direccion </w:t>
-      </w:r>
+      </w:r>
+      <w:proofErr w:type="spellStart"/>
+      <w:r>
+        <w:t>direccion</w:t>
+      </w:r>
+      <w:proofErr w:type="spellEnd"/>
+      <w:r>
+        <w:t xml:space="preserve"> </w:t>
+      </w:r>
+      <w:proofErr w:type="spellStart"/>
+      <w:proofErr w:type="gramStart"/>
       <w:r>
         <w:rPr>
           <w:b/>
@@ -1854,9 +2243,15 @@
         </w:rPr>
         <w:t>varchar</w:t>
       </w:r>
-      <w:r>
-        <w:t xml:space="preserve">(120) </w:t>
-      </w:r>
+      <w:proofErr w:type="spellEnd"/>
+      <w:r>
+        <w:t>(</w:t>
+      </w:r>
+      <w:proofErr w:type="gramEnd"/>
+      <w:r>
+        <w:t xml:space="preserve">120) </w:t>
+      </w:r>
+      <w:proofErr w:type="spellStart"/>
       <w:r>
         <w:rPr>
           <w:b/>
@@ -1864,9 +2259,11 @@
         </w:rPr>
         <w:t>not</w:t>
       </w:r>
+      <w:proofErr w:type="spellEnd"/>
       <w:r>
         <w:t xml:space="preserve"> </w:t>
       </w:r>
+      <w:proofErr w:type="spellStart"/>
       <w:r>
         <w:rPr>
           <w:b/>
@@ -1874,6 +2271,7 @@
         </w:rPr>
         <w:t>null</w:t>
       </w:r>
+      <w:proofErr w:type="spellEnd"/>
       <w:r>
         <w:t>,</w:t>
       </w:r>
@@ -1883,6 +2281,7 @@
         <w:tab/>
         <w:t xml:space="preserve">capacidad </w:t>
       </w:r>
+      <w:proofErr w:type="spellStart"/>
       <w:r>
         <w:rPr>
           <w:b/>
@@ -1890,9 +2289,11 @@
         </w:rPr>
         <w:t>int</w:t>
       </w:r>
+      <w:proofErr w:type="spellEnd"/>
       <w:r>
         <w:t xml:space="preserve"> </w:t>
       </w:r>
+      <w:proofErr w:type="spellStart"/>
       <w:r>
         <w:rPr>
           <w:b/>
@@ -1900,9 +2301,11 @@
         </w:rPr>
         <w:t>not</w:t>
       </w:r>
+      <w:proofErr w:type="spellEnd"/>
       <w:r>
         <w:t xml:space="preserve"> </w:t>
       </w:r>
+      <w:proofErr w:type="spellStart"/>
       <w:r>
         <w:rPr>
           <w:b/>
@@ -1910,11 +2313,28 @@
         </w:rPr>
         <w:t>null</w:t>
       </w:r>
+      <w:proofErr w:type="spellEnd"/>
     </w:p>
     <w:p>
       <w:r>
         <w:tab/>
-        <w:t>--poner capacidad not null responde al requerimiento funcional #10 acerca de los reportes</w:t>
+        <w:t xml:space="preserve">--poner capacidad </w:t>
+      </w:r>
+      <w:proofErr w:type="spellStart"/>
+      <w:r>
+        <w:t>not</w:t>
+      </w:r>
+      <w:proofErr w:type="spellEnd"/>
+      <w:r>
+        <w:t xml:space="preserve"> </w:t>
+      </w:r>
+      <w:proofErr w:type="spellStart"/>
+      <w:r>
+        <w:t>null</w:t>
+      </w:r>
+      <w:proofErr w:type="spellEnd"/>
+      <w:r>
+        <w:t xml:space="preserve"> responde al requerimiento funcional #10 acerca de los reportes</w:t>
       </w:r>
     </w:p>
     <w:p>
@@ -1967,9 +2387,11 @@
             <w:tcW w:w="4414" w:type="dxa"/>
           </w:tcPr>
           <w:p>
+            <w:proofErr w:type="spellStart"/>
             <w:r>
               <w:t>id_serie</w:t>
             </w:r>
+            <w:proofErr w:type="spellEnd"/>
           </w:p>
         </w:tc>
         <w:tc>
@@ -1989,9 +2411,11 @@
             <w:tcW w:w="4414" w:type="dxa"/>
           </w:tcPr>
           <w:p>
+            <w:proofErr w:type="spellStart"/>
             <w:r>
               <w:t>Id_usuario_dueño</w:t>
             </w:r>
+            <w:proofErr w:type="spellEnd"/>
           </w:p>
         </w:tc>
         <w:tc>
@@ -2000,7 +2424,15 @@
           </w:tcPr>
           <w:p>
             <w:r>
-              <w:t>INT REFERENCES USUARIOS(id_usuario)</w:t>
+              <w:t xml:space="preserve">INT REFERENCES </w:t>
+            </w:r>
+            <w:proofErr w:type="gramStart"/>
+            <w:r>
+              <w:t>USUARIOS(</w:t>
+            </w:r>
+            <w:proofErr w:type="gramEnd"/>
+            <w:r>
+              <w:t>id_usuario)</w:t>
             </w:r>
           </w:p>
         </w:tc>
@@ -2011,9 +2443,11 @@
             <w:tcW w:w="4414" w:type="dxa"/>
           </w:tcPr>
           <w:p>
+            <w:proofErr w:type="spellStart"/>
             <w:r>
               <w:t>titulo_serie</w:t>
             </w:r>
+            <w:proofErr w:type="spellEnd"/>
           </w:p>
         </w:tc>
         <w:tc>
@@ -2021,8 +2455,13 @@
             <w:tcW w:w="4414" w:type="dxa"/>
           </w:tcPr>
           <w:p>
-            <w:r>
-              <w:t>VARCHAR(100)</w:t>
+            <w:proofErr w:type="gramStart"/>
+            <w:r>
+              <w:t>VARCHAR(</w:t>
+            </w:r>
+            <w:proofErr w:type="gramEnd"/>
+            <w:r>
+              <w:t>100)</w:t>
             </w:r>
           </w:p>
         </w:tc>
@@ -2033,9 +2472,11 @@
             <w:tcW w:w="4414" w:type="dxa"/>
           </w:tcPr>
           <w:p>
+            <w:proofErr w:type="spellStart"/>
             <w:r>
               <w:t>fecha_inicio</w:t>
             </w:r>
+            <w:proofErr w:type="spellEnd"/>
           </w:p>
         </w:tc>
         <w:tc>
@@ -2055,9 +2496,11 @@
             <w:tcW w:w="4414" w:type="dxa"/>
           </w:tcPr>
           <w:p>
+            <w:proofErr w:type="spellStart"/>
             <w:r>
               <w:t>fecha_fin</w:t>
             </w:r>
+            <w:proofErr w:type="spellEnd"/>
           </w:p>
         </w:tc>
         <w:tc>
@@ -2090,14 +2533,29 @@
             <w:tcW w:w="4414" w:type="dxa"/>
           </w:tcPr>
           <w:p>
-            <w:r>
-              <w:t>VARCHAR(15</w:t>
+            <w:proofErr w:type="gramStart"/>
+            <w:r>
+              <w:t>VARCHAR(</w:t>
+            </w:r>
+            <w:proofErr w:type="gramEnd"/>
+            <w:r>
+              <w:t>15</w:t>
             </w:r>
             <w:r>
               <w:t>)</w:t>
             </w:r>
             <w:r>
-              <w:t>. Debe ser: diaria,semanal, mensual o personalizado la cadena de caracteres</w:t>
+              <w:t xml:space="preserve">. Debe ser: </w:t>
+            </w:r>
+            <w:proofErr w:type="spellStart"/>
+            <w:proofErr w:type="gramStart"/>
+            <w:r>
+              <w:t>diaria,semanal</w:t>
+            </w:r>
+            <w:proofErr w:type="spellEnd"/>
+            <w:proofErr w:type="gramEnd"/>
+            <w:r>
+              <w:t>, mensual o personalizado la cadena de caracteres</w:t>
             </w:r>
           </w:p>
         </w:tc>
@@ -2108,12 +2566,14 @@
             <w:tcW w:w="4414" w:type="dxa"/>
           </w:tcPr>
           <w:p>
+            <w:proofErr w:type="spellStart"/>
             <w:r>
               <w:t>i</w:t>
             </w:r>
             <w:r>
               <w:t>ntervalo_en_dias_eventos</w:t>
             </w:r>
+            <w:proofErr w:type="spellEnd"/>
           </w:p>
         </w:tc>
         <w:tc>
@@ -2133,9 +2593,11 @@
             <w:tcW w:w="4414" w:type="dxa"/>
           </w:tcPr>
           <w:p>
+            <w:proofErr w:type="spellStart"/>
             <w:r>
               <w:t>reserva_dias_especificos</w:t>
             </w:r>
+            <w:proofErr w:type="spellEnd"/>
           </w:p>
         </w:tc>
         <w:tc>
@@ -2143,8 +2605,13 @@
             <w:tcW w:w="4414" w:type="dxa"/>
           </w:tcPr>
           <w:p>
-            <w:r>
-              <w:t>VARCHAR(50)</w:t>
+            <w:proofErr w:type="gramStart"/>
+            <w:r>
+              <w:t>VARCHAR(</w:t>
+            </w:r>
+            <w:proofErr w:type="gramEnd"/>
+            <w:r>
+              <w:t>50)</w:t>
             </w:r>
           </w:p>
         </w:tc>
@@ -2157,10 +2624,308 @@
       </w:r>
     </w:p>
     <w:p>
-      <w:r>
-        <w:t>intervalo_en_dias_eventos va a ser nulo, a menos que la clase_periodicidad= ‘periodicidad’</w:t>
-      </w:r>
-    </w:p>
+      <w:proofErr w:type="spellStart"/>
+      <w:r>
+        <w:t>intervalo_en_dias_eventos</w:t>
+      </w:r>
+      <w:proofErr w:type="spellEnd"/>
+      <w:r>
+        <w:t xml:space="preserve"> va a ser nulo, a menos que la </w:t>
+      </w:r>
+      <w:proofErr w:type="spellStart"/>
+      <w:r>
+        <w:t>clase_periodicidad</w:t>
+      </w:r>
+      <w:proofErr w:type="spellEnd"/>
+      <w:r>
+        <w:t>= ‘per</w:t>
+      </w:r>
+      <w:r>
+        <w:t>sonalizado</w:t>
+      </w:r>
+      <w:r>
+        <w:t>’</w:t>
+      </w:r>
+      <w:r>
+        <w:t xml:space="preserve"> y reserva días específicos será nulo, a menos que la </w:t>
+      </w:r>
+      <w:proofErr w:type="spellStart"/>
+      <w:r>
+        <w:t>clase_periodicidad</w:t>
+      </w:r>
+      <w:proofErr w:type="spellEnd"/>
+      <w:r>
+        <w:t>= ‘semanal’</w:t>
+      </w:r>
+    </w:p>
+    <w:p/>
+    <w:tbl>
+      <w:tblPr>
+        <w:tblStyle w:val="Tablaconcuadrcula"/>
+        <w:tblpPr w:leftFromText="141" w:rightFromText="141" w:vertAnchor="text" w:horzAnchor="margin" w:tblpY="343"/>
+        <w:tblW w:w="0" w:type="auto"/>
+        <w:tblLook w:val="04A0" w:firstRow="1" w:lastRow="0" w:firstColumn="1" w:lastColumn="0" w:noHBand="0" w:noVBand="1"/>
+      </w:tblPr>
+      <w:tblGrid>
+        <w:gridCol w:w="8828"/>
+      </w:tblGrid>
+      <w:tr>
+        <w:tc>
+          <w:tcPr>
+            <w:tcW w:w="8828" w:type="dxa"/>
+          </w:tcPr>
+          <w:p>
+            <w:pPr>
+              <w:jc w:val="center"/>
+            </w:pPr>
+            <w:r>
+              <w:lastRenderedPageBreak/>
+              <w:t xml:space="preserve">TIPOS DE DATO Y REGLA PARA MÓDULO </w:t>
+            </w:r>
+            <w:r>
+              <w:t>3</w:t>
+            </w:r>
+            <w:r>
+              <w:t xml:space="preserve">(entidad = </w:t>
+            </w:r>
+            <w:r>
+              <w:t>TAREAS</w:t>
+            </w:r>
+            <w:r>
+              <w:t>)</w:t>
+            </w:r>
+          </w:p>
+        </w:tc>
+      </w:tr>
+    </w:tbl>
+    <w:p/>
+    <w:tbl>
+      <w:tblPr>
+        <w:tblStyle w:val="Tablaconcuadrcula"/>
+        <w:tblW w:w="0" w:type="auto"/>
+        <w:tblLook w:val="04A0" w:firstRow="1" w:lastRow="0" w:firstColumn="1" w:lastColumn="0" w:noHBand="0" w:noVBand="1"/>
+      </w:tblPr>
+      <w:tblGrid>
+        <w:gridCol w:w="4414"/>
+        <w:gridCol w:w="4414"/>
+      </w:tblGrid>
+      <w:tr>
+        <w:tc>
+          <w:tcPr>
+            <w:tcW w:w="4414" w:type="dxa"/>
+          </w:tcPr>
+          <w:p>
+            <w:proofErr w:type="spellStart"/>
+            <w:r>
+              <w:t>id_tarea</w:t>
+            </w:r>
+            <w:proofErr w:type="spellEnd"/>
+          </w:p>
+        </w:tc>
+        <w:tc>
+          <w:tcPr>
+            <w:tcW w:w="4414" w:type="dxa"/>
+          </w:tcPr>
+          <w:p>
+            <w:r>
+              <w:t>SERIAL PRIMARY KEY</w:t>
+            </w:r>
+          </w:p>
+        </w:tc>
+      </w:tr>
+      <w:tr>
+        <w:tc>
+          <w:tcPr>
+            <w:tcW w:w="4414" w:type="dxa"/>
+          </w:tcPr>
+          <w:p>
+            <w:proofErr w:type="spellStart"/>
+            <w:r>
+              <w:t>Id_usuario_a_cargo</w:t>
+            </w:r>
+            <w:proofErr w:type="spellEnd"/>
+          </w:p>
+        </w:tc>
+        <w:tc>
+          <w:tcPr>
+            <w:tcW w:w="4414" w:type="dxa"/>
+          </w:tcPr>
+          <w:p>
+            <w:r>
+              <w:t xml:space="preserve">REFERENCES </w:t>
+            </w:r>
+            <w:r>
+              <w:t>USUARIOS (</w:t>
+            </w:r>
+            <w:r>
+              <w:t xml:space="preserve">id_usuario) </w:t>
+            </w:r>
+          </w:p>
+        </w:tc>
+      </w:tr>
+      <w:tr>
+        <w:tc>
+          <w:tcPr>
+            <w:tcW w:w="4414" w:type="dxa"/>
+          </w:tcPr>
+          <w:p>
+            <w:proofErr w:type="spellStart"/>
+            <w:r>
+              <w:t>id_evento</w:t>
+            </w:r>
+            <w:proofErr w:type="spellEnd"/>
+          </w:p>
+        </w:tc>
+        <w:tc>
+          <w:tcPr>
+            <w:tcW w:w="4414" w:type="dxa"/>
+          </w:tcPr>
+          <w:p>
+            <w:r>
+              <w:t>REFERENCES EVENTOS (</w:t>
+            </w:r>
+            <w:proofErr w:type="spellStart"/>
+            <w:r>
+              <w:t>id_evento</w:t>
+            </w:r>
+            <w:proofErr w:type="spellEnd"/>
+            <w:r>
+              <w:t>)</w:t>
+            </w:r>
+          </w:p>
+        </w:tc>
+      </w:tr>
+      <w:tr>
+        <w:tc>
+          <w:tcPr>
+            <w:tcW w:w="4414" w:type="dxa"/>
+          </w:tcPr>
+          <w:p>
+            <w:r>
+              <w:t>descripción</w:t>
+            </w:r>
+          </w:p>
+        </w:tc>
+        <w:tc>
+          <w:tcPr>
+            <w:tcW w:w="4414" w:type="dxa"/>
+          </w:tcPr>
+          <w:p>
+            <w:proofErr w:type="gramStart"/>
+            <w:r>
+              <w:t>VARCHAR(</w:t>
+            </w:r>
+            <w:proofErr w:type="gramEnd"/>
+            <w:r>
+              <w:t>150)</w:t>
+            </w:r>
+          </w:p>
+        </w:tc>
+      </w:tr>
+      <w:tr>
+        <w:tc>
+          <w:tcPr>
+            <w:tcW w:w="4414" w:type="dxa"/>
+          </w:tcPr>
+          <w:p>
+            <w:r>
+              <w:t>prioridad</w:t>
+            </w:r>
+          </w:p>
+        </w:tc>
+        <w:tc>
+          <w:tcPr>
+            <w:tcW w:w="4414" w:type="dxa"/>
+          </w:tcPr>
+          <w:p>
+            <w:proofErr w:type="gramStart"/>
+            <w:r>
+              <w:t>VARCHAR(</w:t>
+            </w:r>
+            <w:proofErr w:type="gramEnd"/>
+            <w:r>
+              <w:t>25)</w:t>
+            </w:r>
+          </w:p>
+        </w:tc>
+      </w:tr>
+      <w:tr>
+        <w:tc>
+          <w:tcPr>
+            <w:tcW w:w="4414" w:type="dxa"/>
+          </w:tcPr>
+          <w:p>
+            <w:r>
+              <w:t>titulo</w:t>
+            </w:r>
+          </w:p>
+        </w:tc>
+        <w:tc>
+          <w:tcPr>
+            <w:tcW w:w="4414" w:type="dxa"/>
+          </w:tcPr>
+          <w:p>
+            <w:proofErr w:type="gramStart"/>
+            <w:r>
+              <w:t>VARCHAR(</w:t>
+            </w:r>
+            <w:proofErr w:type="gramEnd"/>
+            <w:r>
+              <w:t>80)</w:t>
+            </w:r>
+          </w:p>
+        </w:tc>
+      </w:tr>
+      <w:tr>
+        <w:tc>
+          <w:tcPr>
+            <w:tcW w:w="4414" w:type="dxa"/>
+          </w:tcPr>
+          <w:p>
+            <w:proofErr w:type="spellStart"/>
+            <w:r>
+              <w:t>fecha_limite</w:t>
+            </w:r>
+            <w:proofErr w:type="spellEnd"/>
+          </w:p>
+        </w:tc>
+        <w:tc>
+          <w:tcPr>
+            <w:tcW w:w="4414" w:type="dxa"/>
+          </w:tcPr>
+          <w:p>
+            <w:r>
+              <w:t>DATE</w:t>
+            </w:r>
+          </w:p>
+        </w:tc>
+      </w:tr>
+      <w:tr>
+        <w:tc>
+          <w:tcPr>
+            <w:tcW w:w="4414" w:type="dxa"/>
+          </w:tcPr>
+          <w:p>
+            <w:r>
+              <w:t>estado</w:t>
+            </w:r>
+          </w:p>
+        </w:tc>
+        <w:tc>
+          <w:tcPr>
+            <w:tcW w:w="4414" w:type="dxa"/>
+          </w:tcPr>
+          <w:p>
+            <w:r>
+              <w:t>VARCHAR (25)</w:t>
+            </w:r>
+          </w:p>
+        </w:tc>
+      </w:tr>
+    </w:tbl>
+    <w:p/>
+    <w:p/>
+    <w:p/>
     <w:sectPr>
       <w:pgSz w:w="12240" w:h="15840"/>
       <w:pgMar w:top="1417" w:right="1701" w:bottom="1417" w:left="1701" w:header="708" w:footer="708" w:gutter="0"/>

</xml_diff>

<commit_message>
DOCUMENTACION: Pruebas de ejecución de create table en documentacion
</commit_message>
<xml_diff>
--- a/DOCUMENTACION/documentacion_proyecto1_BD_LuisDiego.docx
+++ b/DOCUMENTACION/documentacion_proyecto1_BD_LuisDiego.docx
@@ -577,13 +577,8 @@
           <w:numId w:val="4"/>
         </w:numPr>
       </w:pPr>
-      <w:proofErr w:type="spellStart"/>
-      <w:r>
-        <w:t>Id_ubicacion</w:t>
-      </w:r>
-      <w:proofErr w:type="spellEnd"/>
-      <w:r>
-        <w:t xml:space="preserve"> (PK)</w:t>
+      <w:r>
+        <w:t>Id_ubicacion (PK)</w:t>
       </w:r>
     </w:p>
     <w:p>
@@ -651,15 +646,7 @@
         <w:t xml:space="preserve"> una </w:t>
       </w:r>
       <w:r>
-        <w:t>FK =</w:t>
-      </w:r>
-      <w:proofErr w:type="spellStart"/>
-      <w:r>
-        <w:t>id_ubicacion</w:t>
-      </w:r>
-      <w:proofErr w:type="spellEnd"/>
-      <w:r>
-        <w:t>, que refere</w:t>
+        <w:t>FK =id_ubicacion, que refere</w:t>
       </w:r>
       <w:r>
         <w:t>ncia justamente a la llave primaria de la entidad/</w:t>
@@ -692,15 +679,7 @@
     <w:p>
       <w:r>
         <w:lastRenderedPageBreak/>
-        <w:t xml:space="preserve">Esto haría que UBICACIÓN-EVENTOS tenga cardinalidad </w:t>
-      </w:r>
-      <w:proofErr w:type="gramStart"/>
-      <w:r>
-        <w:t>1:N</w:t>
-      </w:r>
-      <w:proofErr w:type="gramEnd"/>
-      <w:r>
-        <w:t>, pues una ubicación se puede relacionar con varios eventos, mientras que un evento solo se refiere a una única ubicación.</w:t>
+        <w:t>Esto haría que UBICACIÓN-EVENTOS tenga cardinalidad 1:N, pues una ubicación se puede relacionar con varios eventos, mientras que un evento solo se refiere a una única ubicación.</w:t>
       </w:r>
     </w:p>
     <w:p/>
@@ -797,13 +776,8 @@
           <w:numId w:val="4"/>
         </w:numPr>
       </w:pPr>
-      <w:proofErr w:type="spellStart"/>
-      <w:r>
-        <w:t>id_serie</w:t>
-      </w:r>
-      <w:proofErr w:type="spellEnd"/>
-      <w:r>
-        <w:t>: PK</w:t>
+      <w:r>
+        <w:t>id_serie: PK</w:t>
       </w:r>
     </w:p>
     <w:p>
@@ -814,11 +788,9 @@
           <w:numId w:val="4"/>
         </w:numPr>
       </w:pPr>
-      <w:proofErr w:type="spellStart"/>
       <w:r>
         <w:t>fecha_inicio</w:t>
       </w:r>
-      <w:proofErr w:type="spellEnd"/>
     </w:p>
     <w:p>
       <w:pPr>
@@ -828,11 +800,9 @@
           <w:numId w:val="4"/>
         </w:numPr>
       </w:pPr>
-      <w:proofErr w:type="spellStart"/>
       <w:r>
         <w:t>fecha_fin</w:t>
       </w:r>
-      <w:proofErr w:type="spellEnd"/>
     </w:p>
     <w:p>
       <w:pPr>
@@ -842,29 +812,8 @@
           <w:numId w:val="4"/>
         </w:numPr>
       </w:pPr>
-      <w:proofErr w:type="spellStart"/>
-      <w:r>
-        <w:t>reglas_patrones_periodicidad</w:t>
-      </w:r>
-      <w:proofErr w:type="spellEnd"/>
-      <w:r>
-        <w:t xml:space="preserve">-&gt;se divide en 3 </w:t>
-      </w:r>
-      <w:proofErr w:type="spellStart"/>
-      <w:r>
-        <w:t>sub-atributos</w:t>
-      </w:r>
-      <w:proofErr w:type="spellEnd"/>
-      <w:r>
-        <w:t>. Tenemos “</w:t>
-      </w:r>
-      <w:proofErr w:type="spellStart"/>
-      <w:r>
-        <w:t>clase_periodicidad</w:t>
-      </w:r>
-      <w:proofErr w:type="spellEnd"/>
-      <w:r>
-        <w:t>”, el cual nos indica si el evento se repite diaria, semanal o mensualmente</w:t>
+      <w:r>
+        <w:t>reglas_patrones_periodicidad-&gt;se divide en 3 sub-atributos. Tenemos “clase_periodicidad”, el cual nos indica si el evento se repite diaria, semanal o mensualmente</w:t>
       </w:r>
       <w:r>
         <w:t xml:space="preserve"> o personalizado</w:t>
@@ -882,15 +831,7 @@
         <w:t xml:space="preserve"> opciones</w:t>
       </w:r>
       <w:r>
-        <w:t>). Luego contamos con “</w:t>
-      </w:r>
-      <w:proofErr w:type="spellStart"/>
-      <w:r>
-        <w:t>intervalo_en_dias_evento</w:t>
-      </w:r>
-      <w:proofErr w:type="spellEnd"/>
-      <w:r>
-        <w:t xml:space="preserve">” el cual refleja cada cuanto </w:t>
+        <w:t xml:space="preserve">). Luego contamos con “intervalo_en_dias_evento” el cual refleja cada cuanto </w:t>
       </w:r>
       <w:r>
         <w:t>se repite el evento, en caso de elegir que se repita de manera personalizada el evento.</w:t>
@@ -906,15 +847,7 @@
         <w:pStyle w:val="Prrafodelista"/>
       </w:pPr>
       <w:r>
-        <w:t xml:space="preserve"> Esto quiere decir que el atributo “</w:t>
-      </w:r>
-      <w:proofErr w:type="spellStart"/>
-      <w:r>
-        <w:t>intervalo_en_dias_evento</w:t>
-      </w:r>
-      <w:proofErr w:type="spellEnd"/>
-      <w:r>
-        <w:t>” es NULO en caso de que se elija una clase de periodicidad distinta a ‘personalizado’, en caso contrario, se llenan ambos campos de los atributos, el primer atributo tendría un registro= ‘personalizado’ y el otro atributo tendría el intervalo en X días de repetición.</w:t>
+        <w:t xml:space="preserve"> Esto quiere decir que el atributo “intervalo_en_dias_evento” es NULO en caso de que se elija una clase de periodicidad distinta a ‘personalizado’, en caso contrario, se llenan ambos campos de los atributos, el primer atributo tendría un registro= ‘personalizado’ y el otro atributo tendría el intervalo en X días de repetición.</w:t>
       </w:r>
     </w:p>
     <w:p>
@@ -927,15 +860,7 @@
         <w:pStyle w:val="Prrafodelista"/>
       </w:pPr>
       <w:r>
-        <w:t>Y por último tendría un atributo llamado “</w:t>
-      </w:r>
-      <w:proofErr w:type="spellStart"/>
-      <w:r>
-        <w:t>titulo_en_pantalla</w:t>
-      </w:r>
-      <w:proofErr w:type="spellEnd"/>
-      <w:r>
-        <w:t>” esto es para darle algo más descriptivo a la serie del evento.</w:t>
+        <w:t>Y por último tendría un atributo llamado “titulo_en_pantalla” esto es para darle algo más descriptivo a la serie del evento.</w:t>
       </w:r>
     </w:p>
     <w:p>
@@ -1038,15 +963,7 @@
     <w:p/>
     <w:p>
       <w:r>
-        <w:t xml:space="preserve">Este </w:t>
-      </w:r>
-      <w:proofErr w:type="spellStart"/>
-      <w:r>
-        <w:t>modulo</w:t>
-      </w:r>
-      <w:proofErr w:type="spellEnd"/>
-      <w:r>
-        <w:t xml:space="preserve"> cuenta como tal con la siguiente entidad con sus atributos:</w:t>
+        <w:t>Este modulo cuenta como tal con la siguiente entidad con sus atributos:</w:t>
       </w:r>
     </w:p>
     <w:p>
@@ -1069,11 +986,9 @@
           <w:numId w:val="4"/>
         </w:numPr>
       </w:pPr>
-      <w:proofErr w:type="spellStart"/>
       <w:r>
         <w:t>id_tarea:PK</w:t>
       </w:r>
-      <w:proofErr w:type="spellEnd"/>
     </w:p>
     <w:p>
       <w:pPr>
@@ -1119,11 +1034,9 @@
           <w:numId w:val="4"/>
         </w:numPr>
       </w:pPr>
-      <w:proofErr w:type="spellStart"/>
       <w:r>
         <w:t>fecha_limite</w:t>
       </w:r>
-      <w:proofErr w:type="spellEnd"/>
     </w:p>
     <w:p>
       <w:pPr>
@@ -1222,15 +1135,7 @@
     </w:p>
     <w:p>
       <w:r>
-        <w:t xml:space="preserve">Después de pensar de </w:t>
-      </w:r>
-      <w:proofErr w:type="spellStart"/>
-      <w:r>
-        <w:t>que</w:t>
-      </w:r>
-      <w:proofErr w:type="spellEnd"/>
-      <w:r>
-        <w:t xml:space="preserve"> manera se unen de manera más natural todos los elementos de los diagramas realizados + el brindado, la propuesta cumple con la lógica y también reglas de negocio.</w:t>
+        <w:t>Después de pensar de que manera se unen de manera más natural todos los elementos de los diagramas realizados + el brindado, la propuesta cumple con la lógica y también reglas de negocio.</w:t>
       </w:r>
     </w:p>
     <w:p/>
@@ -1318,15 +1223,7 @@
     </w:p>
     <w:p>
       <w:r>
-        <w:t xml:space="preserve">Una </w:t>
-      </w:r>
-      <w:proofErr w:type="spellStart"/>
-      <w:r>
-        <w:t>ves</w:t>
-      </w:r>
-      <w:proofErr w:type="spellEnd"/>
-      <w:r>
-        <w:t xml:space="preserve"> completado toda la parte conceptual y visual para comprender de una manera más simplificada los problemas presentados, pues podemos convertir las nuevas entidades con sus atributos y relaciones en Tablas y presentar las tablas de las entidades </w:t>
+        <w:t xml:space="preserve">Una ves completado toda la parte conceptual y visual para comprender de una manera más simplificada los problemas presentados, pues podemos convertir las nuevas entidades con sus atributos y relaciones en Tablas y presentar las tablas de las entidades </w:t>
       </w:r>
       <w:r>
         <w:t>modificadas,</w:t>
@@ -1335,15 +1232,7 @@
         <w:t xml:space="preserve"> en base al modelo lógico visto en el curso</w:t>
       </w:r>
       <w:r>
-        <w:t xml:space="preserve">, el </w:t>
-      </w:r>
-      <w:proofErr w:type="spellStart"/>
-      <w:r>
-        <w:t>cuál</w:t>
-      </w:r>
-      <w:proofErr w:type="spellEnd"/>
-      <w:r>
-        <w:t xml:space="preserve"> se presenta de la siguiente manera:</w:t>
+        <w:t>, el cuál se presenta de la siguiente manera:</w:t>
       </w:r>
     </w:p>
     <w:p/>
@@ -1361,7 +1250,6 @@
       <w:r>
         <w:t xml:space="preserve"> (</w:t>
       </w:r>
-      <w:proofErr w:type="spellStart"/>
       <w:r>
         <w:rPr>
           <w:u w:val="single"/>
@@ -1374,20 +1262,11 @@
         </w:rPr>
         <w:t>ubicacion</w:t>
       </w:r>
-      <w:proofErr w:type="spellEnd"/>
       <w:r>
         <w:t xml:space="preserve"> [</w:t>
       </w:r>
       <w:r>
-        <w:t xml:space="preserve">PK], nombre, ciudad, </w:t>
-      </w:r>
-      <w:proofErr w:type="spellStart"/>
-      <w:r>
-        <w:t>direccion</w:t>
-      </w:r>
-      <w:proofErr w:type="spellEnd"/>
-      <w:r>
-        <w:t>, capacidad)</w:t>
+        <w:t>PK], nombre, ciudad, direccion, capacidad)</w:t>
       </w:r>
     </w:p>
     <w:p>
@@ -1401,7 +1280,6 @@
       <w:r>
         <w:t>SERIES_EVENTOS (</w:t>
       </w:r>
-      <w:proofErr w:type="spellStart"/>
       <w:r>
         <w:rPr>
           <w:u w:val="single"/>
@@ -1414,74 +1292,17 @@
         </w:rPr>
         <w:t>serie</w:t>
       </w:r>
-      <w:proofErr w:type="spellEnd"/>
       <w:r>
         <w:t xml:space="preserve"> [</w:t>
       </w:r>
       <w:r>
-        <w:t xml:space="preserve">PK], </w:t>
-      </w:r>
-      <w:proofErr w:type="spellStart"/>
-      <w:r>
-        <w:t>id_usuario_</w:t>
-      </w:r>
-      <w:r>
-        <w:t>propietario</w:t>
-      </w:r>
-      <w:proofErr w:type="spellEnd"/>
-      <w:r>
-        <w:t xml:space="preserve"> [</w:t>
-      </w:r>
-      <w:r>
-        <w:t xml:space="preserve">FK], </w:t>
-      </w:r>
-      <w:proofErr w:type="spellStart"/>
-      <w:r>
-        <w:t>titulo_serie</w:t>
-      </w:r>
-      <w:proofErr w:type="spellEnd"/>
-      <w:r>
-        <w:t xml:space="preserve">, </w:t>
-      </w:r>
-      <w:proofErr w:type="spellStart"/>
-      <w:r>
-        <w:t>fecha_inicio</w:t>
-      </w:r>
-      <w:proofErr w:type="spellEnd"/>
-      <w:r>
-        <w:t xml:space="preserve">, </w:t>
-      </w:r>
-      <w:proofErr w:type="spellStart"/>
-      <w:r>
-        <w:t>fecha_fin</w:t>
-      </w:r>
-      <w:proofErr w:type="spellEnd"/>
-      <w:r>
-        <w:t xml:space="preserve">, </w:t>
-      </w:r>
-      <w:proofErr w:type="spellStart"/>
-      <w:r>
-        <w:t>clase_periodicidad</w:t>
-      </w:r>
-      <w:proofErr w:type="spellEnd"/>
-      <w:r>
-        <w:t xml:space="preserve">, </w:t>
-      </w:r>
-      <w:proofErr w:type="spellStart"/>
-      <w:r>
-        <w:t>intervalo_en_dias_evento</w:t>
-      </w:r>
-      <w:proofErr w:type="spellEnd"/>
-      <w:r>
-        <w:t xml:space="preserve">, </w:t>
-      </w:r>
-      <w:proofErr w:type="spellStart"/>
-      <w:r>
-        <w:t>reserva_dias_especifios_eventos</w:t>
-      </w:r>
-      <w:proofErr w:type="spellEnd"/>
-      <w:r>
-        <w:t>)</w:t>
+        <w:t>PK], id_usuario_</w:t>
+      </w:r>
+      <w:r>
+        <w:t>propietario [</w:t>
+      </w:r>
+      <w:r>
+        <w:t>FK], titulo_serie, fecha_inicio, fecha_fin, clase_periodicidad, intervalo_en_dias_evento, reserva_dias_especifios_eventos)</w:t>
       </w:r>
     </w:p>
     <w:p>
@@ -1530,75 +1351,19 @@
         <w:rPr>
           <w:highlight w:val="cyan"/>
         </w:rPr>
-        <w:t>NOTA 2: En esta tabla se pueden dar ciertos casos como los siguientes: ‘</w:t>
-      </w:r>
-      <w:proofErr w:type="spellStart"/>
+        <w:t>NOTA 2: En esta tabla se pueden dar ciertos casos como los siguientes: ‘reserva_dias_especificos’ será nulo, solo en caso de que ‘clase periodicidad’ se agregue como ‘personalizado’</w:t>
+      </w:r>
       <w:r>
         <w:rPr>
           <w:highlight w:val="cyan"/>
         </w:rPr>
-        <w:t>reserva_dias_especificos</w:t>
-      </w:r>
-      <w:proofErr w:type="spellEnd"/>
+        <w:t>. El otro caso es en el que ´reserva_dias_especificos’ puede ser Nulo debido a que ‘clase_periodicidad’ es semanal</w:t>
+      </w:r>
       <w:r>
         <w:rPr>
           <w:highlight w:val="cyan"/>
         </w:rPr>
-        <w:t>’ será nulo, solo en caso de que ‘clase periodicidad’ se agregue como ‘personalizado’</w:t>
-      </w:r>
-      <w:r>
-        <w:rPr>
-          <w:highlight w:val="cyan"/>
-        </w:rPr>
-        <w:t>. El otro caso es en el que ´</w:t>
-      </w:r>
-      <w:proofErr w:type="spellStart"/>
-      <w:r>
-        <w:rPr>
-          <w:highlight w:val="cyan"/>
-        </w:rPr>
-        <w:t>reserva_dias_especificos</w:t>
-      </w:r>
-      <w:proofErr w:type="spellEnd"/>
-      <w:r>
-        <w:rPr>
-          <w:highlight w:val="cyan"/>
-        </w:rPr>
-        <w:t>’ puede ser Nulo debido a que ‘</w:t>
-      </w:r>
-      <w:proofErr w:type="spellStart"/>
-      <w:r>
-        <w:rPr>
-          <w:highlight w:val="cyan"/>
-        </w:rPr>
-        <w:t>clase_periodicidad</w:t>
-      </w:r>
-      <w:proofErr w:type="spellEnd"/>
-      <w:r>
-        <w:rPr>
-          <w:highlight w:val="cyan"/>
-        </w:rPr>
-        <w:t>’ es semanal</w:t>
-      </w:r>
-      <w:r>
-        <w:rPr>
-          <w:highlight w:val="cyan"/>
-        </w:rPr>
-        <w:t xml:space="preserve">, pero si las ocurrencias son semanales, pero por ejemplo con 2 </w:t>
-      </w:r>
-      <w:proofErr w:type="spellStart"/>
-      <w:r>
-        <w:rPr>
-          <w:highlight w:val="cyan"/>
-        </w:rPr>
-        <w:t>dias</w:t>
-      </w:r>
-      <w:proofErr w:type="spellEnd"/>
-      <w:r>
-        <w:rPr>
-          <w:highlight w:val="cyan"/>
-        </w:rPr>
-        <w:t xml:space="preserve"> a la semana, ahí si se deben agregar.</w:t>
+        <w:t>, pero si las ocurrencias son semanales, pero por ejemplo con 2 dias a la semana, ahí si se deben agregar.</w:t>
       </w:r>
     </w:p>
     <w:p>
@@ -1618,117 +1383,24 @@
         </w:numPr>
       </w:pPr>
       <w:r>
-        <w:t>TAREAS (</w:t>
-      </w:r>
-      <w:proofErr w:type="spellStart"/>
-      <w:r>
-        <w:t>id_</w:t>
-      </w:r>
-      <w:proofErr w:type="gramStart"/>
-      <w:r>
-        <w:t>tarea</w:t>
-      </w:r>
-      <w:proofErr w:type="spellEnd"/>
-      <w:r>
-        <w:t>[</w:t>
-      </w:r>
-      <w:proofErr w:type="gramEnd"/>
-      <w:r>
-        <w:t xml:space="preserve">PK], </w:t>
-      </w:r>
-      <w:proofErr w:type="spellStart"/>
-      <w:r>
-        <w:t>id_usuario_a_</w:t>
-      </w:r>
-      <w:proofErr w:type="gramStart"/>
-      <w:r>
-        <w:t>cargo</w:t>
-      </w:r>
-      <w:proofErr w:type="spellEnd"/>
-      <w:r>
-        <w:t>[</w:t>
-      </w:r>
-      <w:proofErr w:type="gramEnd"/>
-      <w:r>
-        <w:t xml:space="preserve">FK], </w:t>
-      </w:r>
-      <w:proofErr w:type="spellStart"/>
-      <w:r>
-        <w:t>id_</w:t>
-      </w:r>
-      <w:proofErr w:type="gramStart"/>
-      <w:r>
-        <w:t>evento</w:t>
-      </w:r>
-      <w:proofErr w:type="spellEnd"/>
-      <w:r>
-        <w:t>[</w:t>
-      </w:r>
-      <w:proofErr w:type="gramEnd"/>
-      <w:r>
-        <w:t>FK],</w:t>
-      </w:r>
-      <w:r>
-        <w:t xml:space="preserve"> titulo, descripción, prioridad, </w:t>
-      </w:r>
-      <w:proofErr w:type="spellStart"/>
-      <w:r>
-        <w:t>fecha_limite</w:t>
-      </w:r>
-      <w:proofErr w:type="spellEnd"/>
-      <w:r>
-        <w:t>, estado)</w:t>
-      </w:r>
-    </w:p>
-    <w:p>
-      <w:r>
-        <w:t xml:space="preserve">Y por </w:t>
-      </w:r>
-      <w:proofErr w:type="spellStart"/>
-      <w:r>
-        <w:t>ultimo</w:t>
-      </w:r>
-      <w:proofErr w:type="spellEnd"/>
-      <w:r>
-        <w:t xml:space="preserve"> la tabla modificada </w:t>
+        <w:t xml:space="preserve">TAREAS (id_tarea[PK], id_usuario_a_cargo[FK], </w:t>
+      </w:r>
+      <w:r>
+        <w:t>id_evento[FK],</w:t>
+      </w:r>
+      <w:r>
+        <w:t xml:space="preserve"> titulo, descripción, prioridad, fecha_limite, estado)</w:t>
+      </w:r>
+    </w:p>
+    <w:p>
+      <w:r>
+        <w:t xml:space="preserve">Y por ultimo la tabla modificada </w:t>
       </w:r>
     </w:p>
     <w:p>
       <w:r>
         <w:lastRenderedPageBreak/>
-        <w:t>EVENTOS (</w:t>
-      </w:r>
-      <w:proofErr w:type="spellStart"/>
-      <w:r>
-        <w:t>id_</w:t>
-      </w:r>
-      <w:proofErr w:type="gramStart"/>
-      <w:r>
-        <w:t>ubicacion</w:t>
-      </w:r>
-      <w:proofErr w:type="spellEnd"/>
-      <w:r>
-        <w:t>[</w:t>
-      </w:r>
-      <w:proofErr w:type="gramEnd"/>
-      <w:r>
-        <w:t xml:space="preserve">FK], </w:t>
-      </w:r>
-      <w:proofErr w:type="spellStart"/>
-      <w:r>
-        <w:t>id_</w:t>
-      </w:r>
-      <w:proofErr w:type="gramStart"/>
-      <w:r>
-        <w:t>serie</w:t>
-      </w:r>
-      <w:proofErr w:type="spellEnd"/>
-      <w:r>
-        <w:t>[</w:t>
-      </w:r>
-      <w:proofErr w:type="gramEnd"/>
-      <w:r>
-        <w:t>FK</w:t>
+        <w:t>EVENTOS (id_ubicacion[FK], id_serie[FK</w:t>
       </w:r>
       <w:r>
         <w:t>]) estos</w:t>
@@ -1765,15 +1437,7 @@
         <w:t>un caso</w:t>
       </w:r>
       <w:r>
-        <w:t xml:space="preserve"> en el que se comparte un teléfono como en una casa, pues entonces por </w:t>
-      </w:r>
-      <w:proofErr w:type="spellStart"/>
-      <w:r>
-        <w:t>mas</w:t>
-      </w:r>
-      <w:proofErr w:type="spellEnd"/>
-      <w:r>
-        <w:t xml:space="preserve"> q el id de un usuario sea distinto, no lo dejará agregar por ser PK solo teléfono</w:t>
+        <w:t xml:space="preserve"> en el que se comparte un teléfono como en una casa, pues entonces por mas q el id de un usuario sea distinto, no lo dejará agregar por ser PK solo teléfono</w:t>
       </w:r>
     </w:p>
     <w:p>
@@ -1861,11 +1525,9 @@
             <w:tcW w:w="4414" w:type="dxa"/>
           </w:tcPr>
           <w:p>
-            <w:proofErr w:type="spellStart"/>
             <w:r>
               <w:t>id_ubicacion</w:t>
             </w:r>
-            <w:proofErr w:type="spellEnd"/>
           </w:p>
         </w:tc>
         <w:tc>
@@ -1950,11 +1612,9 @@
             <w:tcW w:w="4414" w:type="dxa"/>
           </w:tcPr>
           <w:p>
-            <w:proofErr w:type="spellStart"/>
             <w:r>
               <w:t>direccion</w:t>
             </w:r>
-            <w:proofErr w:type="spellEnd"/>
           </w:p>
         </w:tc>
         <w:tc>
@@ -2006,15 +1666,7 @@
         <w:t xml:space="preserve">NOTA: </w:t>
       </w:r>
       <w:r>
-        <w:t xml:space="preserve">Para capacidad se agregará un </w:t>
-      </w:r>
-      <w:proofErr w:type="spellStart"/>
-      <w:r>
-        <w:t>check</w:t>
-      </w:r>
-      <w:proofErr w:type="spellEnd"/>
-      <w:r>
-        <w:t xml:space="preserve"> para confirmar que nunca sean negativos sus valores en los registros.</w:t>
+        <w:t>Para capacidad se agregará un check para confirmar que nunca sean negativos sus valores en los registros.</w:t>
       </w:r>
     </w:p>
     <w:p>
@@ -2023,7 +1675,6 @@
       </w:r>
     </w:p>
     <w:p>
-      <w:proofErr w:type="spellStart"/>
       <w:r>
         <w:rPr>
           <w:b/>
@@ -2032,7 +1683,6 @@
         <w:lastRenderedPageBreak/>
         <w:t>create</w:t>
       </w:r>
-      <w:proofErr w:type="spellEnd"/>
       <w:r>
         <w:t xml:space="preserve"> </w:t>
       </w:r>
@@ -2050,16 +1700,8 @@
     <w:p>
       <w:r>
         <w:tab/>
-      </w:r>
-      <w:proofErr w:type="spellStart"/>
-      <w:r>
-        <w:t>id_ubicacion</w:t>
-      </w:r>
-      <w:proofErr w:type="spellEnd"/>
-      <w:r>
-        <w:t xml:space="preserve"> SERIAL </w:t>
-      </w:r>
-      <w:proofErr w:type="spellStart"/>
+        <w:t xml:space="preserve">id_ubicacion SERIAL </w:t>
+      </w:r>
       <w:r>
         <w:rPr>
           <w:b/>
@@ -2067,11 +1709,9 @@
         </w:rPr>
         <w:t>primary</w:t>
       </w:r>
-      <w:proofErr w:type="spellEnd"/>
       <w:r>
         <w:t xml:space="preserve"> </w:t>
       </w:r>
-      <w:proofErr w:type="spellStart"/>
       <w:r>
         <w:rPr>
           <w:b/>
@@ -2079,7 +1719,6 @@
         </w:rPr>
         <w:t>key</w:t>
       </w:r>
-      <w:proofErr w:type="spellEnd"/>
       <w:r>
         <w:t>,</w:t>
       </w:r>
@@ -2166,8 +1805,6 @@
       <w:r>
         <w:t xml:space="preserve">ciudad </w:t>
       </w:r>
-      <w:proofErr w:type="spellStart"/>
-      <w:proofErr w:type="gramStart"/>
       <w:r>
         <w:rPr>
           <w:b/>
@@ -2175,15 +1812,9 @@
         </w:rPr>
         <w:t>varchar</w:t>
       </w:r>
-      <w:proofErr w:type="spellEnd"/>
-      <w:r>
-        <w:t>(</w:t>
-      </w:r>
-      <w:proofErr w:type="gramEnd"/>
-      <w:r>
-        <w:t xml:space="preserve">60) </w:t>
-      </w:r>
-      <w:proofErr w:type="spellStart"/>
+      <w:r>
+        <w:t xml:space="preserve">(60) </w:t>
+      </w:r>
       <w:r>
         <w:rPr>
           <w:b/>
@@ -2191,11 +1822,9 @@
         </w:rPr>
         <w:t>not</w:t>
       </w:r>
-      <w:proofErr w:type="spellEnd"/>
       <w:r>
         <w:t xml:space="preserve"> </w:t>
       </w:r>
-      <w:proofErr w:type="spellStart"/>
       <w:r>
         <w:rPr>
           <w:b/>
@@ -2203,7 +1832,6 @@
         </w:rPr>
         <w:t>null</w:t>
       </w:r>
-      <w:proofErr w:type="spellEnd"/>
       <w:r>
         <w:t>,</w:t>
       </w:r>
@@ -2211,31 +1839,14 @@
     <w:p>
       <w:r>
         <w:tab/>
-        <w:t xml:space="preserve">--este atributo no es </w:t>
-      </w:r>
-      <w:proofErr w:type="spellStart"/>
-      <w:r>
-        <w:t>unico</w:t>
-      </w:r>
-      <w:proofErr w:type="spellEnd"/>
-      <w:r>
-        <w:t>, pues sino no se cumple lo de gestionar varias salas que pueden estar en la misma ciudad</w:t>
+        <w:t>--este atributo no es unico, pues sino no se cumple lo de gestionar varias salas que pueden estar en la misma ciudad</w:t>
       </w:r>
     </w:p>
     <w:p>
       <w:r>
         <w:tab/>
-      </w:r>
-      <w:proofErr w:type="spellStart"/>
-      <w:r>
-        <w:t>direccion</w:t>
-      </w:r>
-      <w:proofErr w:type="spellEnd"/>
-      <w:r>
-        <w:t xml:space="preserve"> </w:t>
-      </w:r>
-      <w:proofErr w:type="spellStart"/>
-      <w:proofErr w:type="gramStart"/>
+        <w:t xml:space="preserve">direccion </w:t>
+      </w:r>
       <w:r>
         <w:rPr>
           <w:b/>
@@ -2243,15 +1854,9 @@
         </w:rPr>
         <w:t>varchar</w:t>
       </w:r>
-      <w:proofErr w:type="spellEnd"/>
-      <w:r>
-        <w:t>(</w:t>
-      </w:r>
-      <w:proofErr w:type="gramEnd"/>
-      <w:r>
-        <w:t xml:space="preserve">120) </w:t>
-      </w:r>
-      <w:proofErr w:type="spellStart"/>
+      <w:r>
+        <w:t xml:space="preserve">(120) </w:t>
+      </w:r>
       <w:r>
         <w:rPr>
           <w:b/>
@@ -2259,11 +1864,9 @@
         </w:rPr>
         <w:t>not</w:t>
       </w:r>
-      <w:proofErr w:type="spellEnd"/>
       <w:r>
         <w:t xml:space="preserve"> </w:t>
       </w:r>
-      <w:proofErr w:type="spellStart"/>
       <w:r>
         <w:rPr>
           <w:b/>
@@ -2271,7 +1874,6 @@
         </w:rPr>
         <w:t>null</w:t>
       </w:r>
-      <w:proofErr w:type="spellEnd"/>
       <w:r>
         <w:t>,</w:t>
       </w:r>
@@ -2281,7 +1883,6 @@
         <w:tab/>
         <w:t xml:space="preserve">capacidad </w:t>
       </w:r>
-      <w:proofErr w:type="spellStart"/>
       <w:r>
         <w:rPr>
           <w:b/>
@@ -2289,11 +1890,9 @@
         </w:rPr>
         <w:t>int</w:t>
       </w:r>
-      <w:proofErr w:type="spellEnd"/>
       <w:r>
         <w:t xml:space="preserve"> </w:t>
       </w:r>
-      <w:proofErr w:type="spellStart"/>
       <w:r>
         <w:rPr>
           <w:b/>
@@ -2301,11 +1900,9 @@
         </w:rPr>
         <w:t>not</w:t>
       </w:r>
-      <w:proofErr w:type="spellEnd"/>
       <w:r>
         <w:t xml:space="preserve"> </w:t>
       </w:r>
-      <w:proofErr w:type="spellStart"/>
       <w:r>
         <w:rPr>
           <w:b/>
@@ -2313,28 +1910,11 @@
         </w:rPr>
         <w:t>null</w:t>
       </w:r>
-      <w:proofErr w:type="spellEnd"/>
     </w:p>
     <w:p>
       <w:r>
         <w:tab/>
-        <w:t xml:space="preserve">--poner capacidad </w:t>
-      </w:r>
-      <w:proofErr w:type="spellStart"/>
-      <w:r>
-        <w:t>not</w:t>
-      </w:r>
-      <w:proofErr w:type="spellEnd"/>
-      <w:r>
-        <w:t xml:space="preserve"> </w:t>
-      </w:r>
-      <w:proofErr w:type="spellStart"/>
-      <w:r>
-        <w:t>null</w:t>
-      </w:r>
-      <w:proofErr w:type="spellEnd"/>
-      <w:r>
-        <w:t xml:space="preserve"> responde al requerimiento funcional #10 acerca de los reportes</w:t>
+        <w:t>--poner capacidad not null responde al requerimiento funcional #10 acerca de los reportes</w:t>
       </w:r>
     </w:p>
     <w:p>
@@ -2387,11 +1967,9 @@
             <w:tcW w:w="4414" w:type="dxa"/>
           </w:tcPr>
           <w:p>
-            <w:proofErr w:type="spellStart"/>
             <w:r>
               <w:t>id_serie</w:t>
             </w:r>
-            <w:proofErr w:type="spellEnd"/>
           </w:p>
         </w:tc>
         <w:tc>
@@ -2411,11 +1989,9 @@
             <w:tcW w:w="4414" w:type="dxa"/>
           </w:tcPr>
           <w:p>
-            <w:proofErr w:type="spellStart"/>
             <w:r>
               <w:t>Id_usuario_dueño</w:t>
             </w:r>
-            <w:proofErr w:type="spellEnd"/>
           </w:p>
         </w:tc>
         <w:tc>
@@ -2424,15 +2000,7 @@
           </w:tcPr>
           <w:p>
             <w:r>
-              <w:t xml:space="preserve">INT REFERENCES </w:t>
-            </w:r>
-            <w:proofErr w:type="gramStart"/>
-            <w:r>
-              <w:t>USUARIOS(</w:t>
-            </w:r>
-            <w:proofErr w:type="gramEnd"/>
-            <w:r>
-              <w:t>id_usuario)</w:t>
+              <w:t>INT REFERENCES USUARIOS(id_usuario)</w:t>
             </w:r>
           </w:p>
         </w:tc>
@@ -2443,11 +2011,9 @@
             <w:tcW w:w="4414" w:type="dxa"/>
           </w:tcPr>
           <w:p>
-            <w:proofErr w:type="spellStart"/>
             <w:r>
               <w:t>titulo_serie</w:t>
             </w:r>
-            <w:proofErr w:type="spellEnd"/>
           </w:p>
         </w:tc>
         <w:tc>
@@ -2455,13 +2021,8 @@
             <w:tcW w:w="4414" w:type="dxa"/>
           </w:tcPr>
           <w:p>
-            <w:proofErr w:type="gramStart"/>
-            <w:r>
-              <w:t>VARCHAR(</w:t>
-            </w:r>
-            <w:proofErr w:type="gramEnd"/>
-            <w:r>
-              <w:t>100)</w:t>
+            <w:r>
+              <w:t>VARCHAR(100)</w:t>
             </w:r>
           </w:p>
         </w:tc>
@@ -2472,11 +2033,9 @@
             <w:tcW w:w="4414" w:type="dxa"/>
           </w:tcPr>
           <w:p>
-            <w:proofErr w:type="spellStart"/>
             <w:r>
               <w:t>fecha_inicio</w:t>
             </w:r>
-            <w:proofErr w:type="spellEnd"/>
           </w:p>
         </w:tc>
         <w:tc>
@@ -2496,11 +2055,9 @@
             <w:tcW w:w="4414" w:type="dxa"/>
           </w:tcPr>
           <w:p>
-            <w:proofErr w:type="spellStart"/>
             <w:r>
               <w:t>fecha_fin</w:t>
             </w:r>
-            <w:proofErr w:type="spellEnd"/>
           </w:p>
         </w:tc>
         <w:tc>
@@ -2533,29 +2090,14 @@
             <w:tcW w:w="4414" w:type="dxa"/>
           </w:tcPr>
           <w:p>
-            <w:proofErr w:type="gramStart"/>
-            <w:r>
-              <w:t>VARCHAR(</w:t>
-            </w:r>
-            <w:proofErr w:type="gramEnd"/>
-            <w:r>
-              <w:t>15</w:t>
+            <w:r>
+              <w:t>VARCHAR(15</w:t>
             </w:r>
             <w:r>
               <w:t>)</w:t>
             </w:r>
             <w:r>
-              <w:t xml:space="preserve">. Debe ser: </w:t>
-            </w:r>
-            <w:proofErr w:type="spellStart"/>
-            <w:proofErr w:type="gramStart"/>
-            <w:r>
-              <w:t>diaria,semanal</w:t>
-            </w:r>
-            <w:proofErr w:type="spellEnd"/>
-            <w:proofErr w:type="gramEnd"/>
-            <w:r>
-              <w:t>, mensual o personalizado la cadena de caracteres</w:t>
+              <w:t>. Debe ser: diaria,semanal, mensual o personalizado la cadena de caracteres</w:t>
             </w:r>
           </w:p>
         </w:tc>
@@ -2566,14 +2108,12 @@
             <w:tcW w:w="4414" w:type="dxa"/>
           </w:tcPr>
           <w:p>
-            <w:proofErr w:type="spellStart"/>
             <w:r>
               <w:t>i</w:t>
             </w:r>
             <w:r>
               <w:t>ntervalo_en_dias_eventos</w:t>
             </w:r>
-            <w:proofErr w:type="spellEnd"/>
           </w:p>
         </w:tc>
         <w:tc>
@@ -2593,11 +2133,9 @@
             <w:tcW w:w="4414" w:type="dxa"/>
           </w:tcPr>
           <w:p>
-            <w:proofErr w:type="spellStart"/>
             <w:r>
               <w:t>reserva_dias_especificos</w:t>
             </w:r>
-            <w:proofErr w:type="spellEnd"/>
           </w:p>
         </w:tc>
         <w:tc>
@@ -2605,13 +2143,8 @@
             <w:tcW w:w="4414" w:type="dxa"/>
           </w:tcPr>
           <w:p>
-            <w:proofErr w:type="gramStart"/>
-            <w:r>
-              <w:t>VARCHAR(</w:t>
-            </w:r>
-            <w:proofErr w:type="gramEnd"/>
-            <w:r>
-              <w:t>50)</w:t>
+            <w:r>
+              <w:t>VARCHAR(50)</w:t>
             </w:r>
           </w:p>
         </w:tc>
@@ -2624,21 +2157,8 @@
       </w:r>
     </w:p>
     <w:p>
-      <w:proofErr w:type="spellStart"/>
-      <w:r>
-        <w:t>intervalo_en_dias_eventos</w:t>
-      </w:r>
-      <w:proofErr w:type="spellEnd"/>
-      <w:r>
-        <w:t xml:space="preserve"> va a ser nulo, a menos que la </w:t>
-      </w:r>
-      <w:proofErr w:type="spellStart"/>
-      <w:r>
-        <w:t>clase_periodicidad</w:t>
-      </w:r>
-      <w:proofErr w:type="spellEnd"/>
-      <w:r>
-        <w:t>= ‘per</w:t>
+      <w:r>
+        <w:t>intervalo_en_dias_eventos va a ser nulo, a menos que la clase_periodicidad= ‘per</w:t>
       </w:r>
       <w:r>
         <w:t>sonalizado</w:t>
@@ -2647,15 +2167,7 @@
         <w:t>’</w:t>
       </w:r>
       <w:r>
-        <w:t xml:space="preserve"> y reserva días específicos será nulo, a menos que la </w:t>
-      </w:r>
-      <w:proofErr w:type="spellStart"/>
-      <w:r>
-        <w:t>clase_periodicidad</w:t>
-      </w:r>
-      <w:proofErr w:type="spellEnd"/>
-      <w:r>
-        <w:t>= ‘semanal’</w:t>
+        <w:t xml:space="preserve"> y reserva días específicos será nulo, a menos que la clase_periodicidad= ‘semanal’</w:t>
       </w:r>
     </w:p>
     <w:p/>
@@ -2715,11 +2227,9 @@
             <w:tcW w:w="4414" w:type="dxa"/>
           </w:tcPr>
           <w:p>
-            <w:proofErr w:type="spellStart"/>
             <w:r>
               <w:t>id_tarea</w:t>
             </w:r>
-            <w:proofErr w:type="spellEnd"/>
           </w:p>
         </w:tc>
         <w:tc>
@@ -2739,11 +2249,9 @@
             <w:tcW w:w="4414" w:type="dxa"/>
           </w:tcPr>
           <w:p>
-            <w:proofErr w:type="spellStart"/>
             <w:r>
               <w:t>Id_usuario_a_cargo</w:t>
             </w:r>
-            <w:proofErr w:type="spellEnd"/>
           </w:p>
         </w:tc>
         <w:tc>
@@ -2751,6 +2259,9 @@
             <w:tcW w:w="4414" w:type="dxa"/>
           </w:tcPr>
           <w:p>
+            <w:r>
+              <w:t>SERIAL /</w:t>
+            </w:r>
             <w:r>
               <w:t xml:space="preserve">REFERENCES </w:t>
             </w:r>
@@ -2769,11 +2280,9 @@
             <w:tcW w:w="4414" w:type="dxa"/>
           </w:tcPr>
           <w:p>
-            <w:proofErr w:type="spellStart"/>
             <w:r>
               <w:t>id_evento</w:t>
             </w:r>
-            <w:proofErr w:type="spellEnd"/>
           </w:p>
         </w:tc>
         <w:tc>
@@ -2782,15 +2291,10 @@
           </w:tcPr>
           <w:p>
             <w:r>
-              <w:t>REFERENCES EVENTOS (</w:t>
-            </w:r>
-            <w:proofErr w:type="spellStart"/>
-            <w:r>
-              <w:t>id_evento</w:t>
-            </w:r>
-            <w:proofErr w:type="spellEnd"/>
-            <w:r>
-              <w:t>)</w:t>
+              <w:t>SERIAL/</w:t>
+            </w:r>
+            <w:r>
+              <w:t>REFERENCES EVENTOS (id_evento)</w:t>
             </w:r>
           </w:p>
         </w:tc>
@@ -2811,11 +2315,9 @@
             <w:tcW w:w="4414" w:type="dxa"/>
           </w:tcPr>
           <w:p>
-            <w:proofErr w:type="gramStart"/>
-            <w:r>
-              <w:t>VARCHAR(</w:t>
-            </w:r>
-            <w:proofErr w:type="gramEnd"/>
+            <w:r>
+              <w:t>VARCHAR (</w:t>
+            </w:r>
             <w:r>
               <w:t>150)</w:t>
             </w:r>
@@ -2838,11 +2340,9 @@
             <w:tcW w:w="4414" w:type="dxa"/>
           </w:tcPr>
           <w:p>
-            <w:proofErr w:type="gramStart"/>
-            <w:r>
-              <w:t>VARCHAR(</w:t>
-            </w:r>
-            <w:proofErr w:type="gramEnd"/>
+            <w:r>
+              <w:t>VARCHAR (</w:t>
+            </w:r>
             <w:r>
               <w:t>25)</w:t>
             </w:r>
@@ -2865,11 +2365,9 @@
             <w:tcW w:w="4414" w:type="dxa"/>
           </w:tcPr>
           <w:p>
-            <w:proofErr w:type="gramStart"/>
-            <w:r>
-              <w:t>VARCHAR(</w:t>
-            </w:r>
-            <w:proofErr w:type="gramEnd"/>
+            <w:r>
+              <w:t>VARCHAR (</w:t>
+            </w:r>
             <w:r>
               <w:t>80)</w:t>
             </w:r>
@@ -2882,11 +2380,9 @@
             <w:tcW w:w="4414" w:type="dxa"/>
           </w:tcPr>
           <w:p>
-            <w:proofErr w:type="spellStart"/>
             <w:r>
               <w:t>fecha_limite</w:t>
             </w:r>
-            <w:proofErr w:type="spellEnd"/>
           </w:p>
         </w:tc>
         <w:tc>
@@ -2924,6 +2420,165 @@
       </w:tr>
     </w:tbl>
     <w:p/>
+    <w:p/>
+    <w:tbl>
+      <w:tblPr>
+        <w:tblStyle w:val="Tablaconcuadrcula"/>
+        <w:tblpPr w:leftFromText="141" w:rightFromText="141" w:vertAnchor="text" w:horzAnchor="margin" w:tblpY="343"/>
+        <w:tblW w:w="0" w:type="auto"/>
+        <w:tblLook w:val="04A0" w:firstRow="1" w:lastRow="0" w:firstColumn="1" w:lastColumn="0" w:noHBand="0" w:noVBand="1"/>
+      </w:tblPr>
+      <w:tblGrid>
+        <w:gridCol w:w="8828"/>
+      </w:tblGrid>
+      <w:tr>
+        <w:tc>
+          <w:tcPr>
+            <w:tcW w:w="8828" w:type="dxa"/>
+          </w:tcPr>
+          <w:p>
+            <w:pPr>
+              <w:jc w:val="center"/>
+            </w:pPr>
+            <w:r>
+              <w:t>TIPOS DE DATO Y REGLA PARA MÓDULO 3(entidad</w:t>
+            </w:r>
+            <w:r>
+              <w:t xml:space="preserve"> a modificar</w:t>
+            </w:r>
+            <w:r>
+              <w:t xml:space="preserve"> =</w:t>
+            </w:r>
+            <w:r>
+              <w:t>EVENTOS</w:t>
+            </w:r>
+            <w:r>
+              <w:t>)</w:t>
+            </w:r>
+          </w:p>
+        </w:tc>
+      </w:tr>
+    </w:tbl>
+    <w:p/>
+    <w:tbl>
+      <w:tblPr>
+        <w:tblStyle w:val="Tablaconcuadrcula"/>
+        <w:tblW w:w="0" w:type="auto"/>
+        <w:tblLook w:val="04A0" w:firstRow="1" w:lastRow="0" w:firstColumn="1" w:lastColumn="0" w:noHBand="0" w:noVBand="1"/>
+      </w:tblPr>
+      <w:tblGrid>
+        <w:gridCol w:w="4414"/>
+        <w:gridCol w:w="4414"/>
+      </w:tblGrid>
+      <w:tr>
+        <w:tc>
+          <w:tcPr>
+            <w:tcW w:w="4414" w:type="dxa"/>
+          </w:tcPr>
+          <w:p>
+            <w:r>
+              <w:t>id_</w:t>
+            </w:r>
+            <w:r>
+              <w:t>ubicacion</w:t>
+            </w:r>
+          </w:p>
+        </w:tc>
+        <w:tc>
+          <w:tcPr>
+            <w:tcW w:w="4414" w:type="dxa"/>
+          </w:tcPr>
+          <w:p>
+            <w:r>
+              <w:t>SERIAL/ REFERENCES UBICACIONES (id_ubicacion)</w:t>
+            </w:r>
+          </w:p>
+        </w:tc>
+      </w:tr>
+      <w:tr>
+        <w:tc>
+          <w:tcPr>
+            <w:tcW w:w="4414" w:type="dxa"/>
+          </w:tcPr>
+          <w:p>
+            <w:r>
+              <w:t>id_serie</w:t>
+            </w:r>
+          </w:p>
+        </w:tc>
+        <w:tc>
+          <w:tcPr>
+            <w:tcW w:w="4414" w:type="dxa"/>
+          </w:tcPr>
+          <w:p>
+            <w:r>
+              <w:t xml:space="preserve">SERIAL </w:t>
+            </w:r>
+            <w:r>
+              <w:t xml:space="preserve">REFERENCES USUARIOS (id_usuario) </w:t>
+            </w:r>
+          </w:p>
+        </w:tc>
+      </w:tr>
+    </w:tbl>
+    <w:p/>
+    <w:p/>
+    <w:p>
+      <w:r>
+        <w:drawing>
+          <wp:anchor distT="0" distB="0" distL="114300" distR="114300" simplePos="0" relativeHeight="251662336" behindDoc="0" locked="0" layoutInCell="1" allowOverlap="1" wp14:anchorId="43F9B2A1" wp14:editId="2B622E97">
+            <wp:simplePos x="0" y="0"/>
+            <wp:positionH relativeFrom="column">
+              <wp:posOffset>-28575</wp:posOffset>
+            </wp:positionH>
+            <wp:positionV relativeFrom="paragraph">
+              <wp:posOffset>330200</wp:posOffset>
+            </wp:positionV>
+            <wp:extent cx="5612130" cy="3136900"/>
+            <wp:effectExtent l="0" t="0" r="7620" b="6350"/>
+            <wp:wrapSquare wrapText="bothSides"/>
+            <wp:docPr id="427656885" name="Imagen 1"/>
+            <wp:cNvGraphicFramePr>
+              <a:graphicFrameLocks xmlns:a="http://schemas.openxmlformats.org/drawingml/2006/main" noChangeAspect="1"/>
+            </wp:cNvGraphicFramePr>
+            <a:graphic xmlns:a="http://schemas.openxmlformats.org/drawingml/2006/main">
+              <a:graphicData uri="http://schemas.openxmlformats.org/drawingml/2006/picture">
+                <pic:pic xmlns:pic="http://schemas.openxmlformats.org/drawingml/2006/picture">
+                  <pic:nvPicPr>
+                    <pic:cNvPr id="427656885" name=""/>
+                    <pic:cNvPicPr/>
+                  </pic:nvPicPr>
+                  <pic:blipFill>
+                    <a:blip r:embed="rId11" cstate="print">
+                      <a:extLst>
+                        <a:ext uri="{28A0092B-C50C-407E-A947-70E740481C1C}">
+                          <a14:useLocalDpi xmlns:a14="http://schemas.microsoft.com/office/drawing/2010/main" val="0"/>
+                        </a:ext>
+                      </a:extLst>
+                    </a:blip>
+                    <a:stretch>
+                      <a:fillRect/>
+                    </a:stretch>
+                  </pic:blipFill>
+                  <pic:spPr>
+                    <a:xfrm>
+                      <a:off x="0" y="0"/>
+                      <a:ext cx="5612130" cy="3136900"/>
+                    </a:xfrm>
+                    <a:prstGeom prst="rect">
+                      <a:avLst/>
+                    </a:prstGeom>
+                  </pic:spPr>
+                </pic:pic>
+              </a:graphicData>
+            </a:graphic>
+          </wp:anchor>
+        </w:drawing>
+      </w:r>
+      <w:r>
+        <w:t>PRUEBAS</w:t>
+      </w:r>
+    </w:p>
     <w:p/>
     <w:p/>
     <w:sectPr>

</xml_diff>

<commit_message>
Documentación: adición de casos de prueba y explicación
</commit_message>
<xml_diff>
--- a/DOCUMENTACION/documentacion_proyecto1_BD_LuisDiego.docx
+++ b/DOCUMENTACION/documentacion_proyecto1_BD_LuisDiego.docx
@@ -2192,19 +2192,7 @@
             </w:pPr>
             <w:r>
               <w:lastRenderedPageBreak/>
-              <w:t xml:space="preserve">TIPOS DE DATO Y REGLA PARA MÓDULO </w:t>
-            </w:r>
-            <w:r>
-              <w:t>3</w:t>
-            </w:r>
-            <w:r>
-              <w:t xml:space="preserve">(entidad = </w:t>
-            </w:r>
-            <w:r>
-              <w:t>TAREAS</w:t>
-            </w:r>
-            <w:r>
-              <w:t>)</w:t>
+              <w:t>TIPOS DE DATO Y REGLA PARA MÓDULO 3(entidad = TAREAS)</w:t>
             </w:r>
           </w:p>
         </w:tc>
@@ -2441,19 +2429,7 @@
               <w:jc w:val="center"/>
             </w:pPr>
             <w:r>
-              <w:t>TIPOS DE DATO Y REGLA PARA MÓDULO 3(entidad</w:t>
-            </w:r>
-            <w:r>
-              <w:t xml:space="preserve"> a modificar</w:t>
-            </w:r>
-            <w:r>
-              <w:t xml:space="preserve"> =</w:t>
-            </w:r>
-            <w:r>
-              <w:t>EVENTOS</w:t>
-            </w:r>
-            <w:r>
-              <w:t>)</w:t>
+              <w:t>TIPOS DE DATO Y REGLA PARA MÓDULO 3(entidad a modificar =EVENTOS)</w:t>
             </w:r>
           </w:p>
         </w:tc>
@@ -2477,10 +2453,7 @@
           </w:tcPr>
           <w:p>
             <w:r>
-              <w:t>id_</w:t>
-            </w:r>
-            <w:r>
-              <w:t>ubicacion</w:t>
+              <w:t>id_ubicacion</w:t>
             </w:r>
           </w:p>
         </w:tc>
@@ -2525,6 +2498,9 @@
     <w:p/>
     <w:p>
       <w:r>
+        <w:rPr>
+          <w:noProof/>
+        </w:rPr>
         <w:drawing>
           <wp:anchor distT="0" distB="0" distL="114300" distR="114300" simplePos="0" relativeHeight="251662336" behindDoc="0" locked="0" layoutInCell="1" allowOverlap="1" wp14:anchorId="43F9B2A1" wp14:editId="2B622E97">
             <wp:simplePos x="0" y="0"/>
@@ -2580,7 +2556,69 @@
       </w:r>
     </w:p>
     <w:p/>
-    <w:p/>
+    <w:p>
+      <w:pPr>
+        <w:rPr>
+          <w:b/>
+          <w:bCs/>
+        </w:rPr>
+      </w:pPr>
+      <w:r>
+        <w:rPr>
+          <w:b/>
+          <w:bCs/>
+        </w:rPr>
+        <w:t>CONTROL DE CONSTRAINTS</w:t>
+      </w:r>
+    </w:p>
+    <w:p>
+      <w:r>
+        <w:drawing>
+          <wp:inline distT="0" distB="0" distL="0" distR="0" wp14:anchorId="44B2563A" wp14:editId="32841638">
+            <wp:extent cx="5735955" cy="3073400"/>
+            <wp:effectExtent l="0" t="0" r="0" b="0"/>
+            <wp:docPr id="245603157" name="Imagen 1"/>
+            <wp:cNvGraphicFramePr>
+              <a:graphicFrameLocks xmlns:a="http://schemas.openxmlformats.org/drawingml/2006/main" noChangeAspect="1"/>
+            </wp:cNvGraphicFramePr>
+            <a:graphic xmlns:a="http://schemas.openxmlformats.org/drawingml/2006/main">
+              <a:graphicData uri="http://schemas.openxmlformats.org/drawingml/2006/picture">
+                <pic:pic xmlns:pic="http://schemas.openxmlformats.org/drawingml/2006/picture">
+                  <pic:nvPicPr>
+                    <pic:cNvPr id="245603157" name=""/>
+                    <pic:cNvPicPr/>
+                  </pic:nvPicPr>
+                  <pic:blipFill>
+                    <a:blip r:embed="rId12"/>
+                    <a:stretch>
+                      <a:fillRect/>
+                    </a:stretch>
+                  </pic:blipFill>
+                  <pic:spPr>
+                    <a:xfrm>
+                      <a:off x="0" y="0"/>
+                      <a:ext cx="5735955" cy="3073400"/>
+                    </a:xfrm>
+                    <a:prstGeom prst="rect">
+                      <a:avLst/>
+                    </a:prstGeom>
+                  </pic:spPr>
+                </pic:pic>
+              </a:graphicData>
+            </a:graphic>
+          </wp:inline>
+        </w:drawing>
+      </w:r>
+    </w:p>
+    <w:p/>
+    <w:p>
+      <w:r>
+        <w:t>LUEGO DE HACER 3 CONSTRAINTS CHECK COMMITEADOS, SE HICI</w:t>
+      </w:r>
+      <w:r>
+        <w:t>ERON CASOS DE PRUEBA, Y ESTE ESPECÍFICAMENTE PARA PROBAR QUE RECHAZA INSERCIONES CON DATOS QUE NO SON CONSISTENTES CON LAS RESTRICCIONES</w:t>
+      </w:r>
+    </w:p>
     <w:sectPr>
       <w:pgSz w:w="12240" w:h="15840"/>
       <w:pgMar w:top="1417" w:right="1701" w:bottom="1417" w:left="1701" w:header="708" w:footer="708" w:gutter="0"/>

</xml_diff>

<commit_message>
DOCUMENTACION: pruebas de funcionalidad
</commit_message>
<xml_diff>
--- a/DOCUMENTACION/documentacion_proyecto1_BD_LuisDiego.docx
+++ b/DOCUMENTACION/documentacion_proyecto1_BD_LuisDiego.docx
@@ -2573,6 +2573,9 @@
     </w:p>
     <w:p>
       <w:r>
+        <w:rPr>
+          <w:noProof/>
+        </w:rPr>
         <w:drawing>
           <wp:inline distT="0" distB="0" distL="0" distR="0" wp14:anchorId="44B2563A" wp14:editId="32841638">
             <wp:extent cx="5735955" cy="3073400"/>
@@ -2617,6 +2620,314 @@
       </w:r>
       <w:r>
         <w:t>ERON CASOS DE PRUEBA, Y ESTE ESPECÍFICAMENTE PARA PROBAR QUE RECHAZA INSERCIONES CON DATOS QUE NO SON CONSISTENTES CON LAS RESTRICCIONES</w:t>
+      </w:r>
+    </w:p>
+    <w:p/>
+    <w:p/>
+    <w:p>
+      <w:pPr>
+        <w:rPr>
+          <w:b/>
+          <w:bCs/>
+        </w:rPr>
+      </w:pPr>
+      <w:r>
+        <w:rPr>
+          <w:b/>
+          <w:bCs/>
+        </w:rPr>
+        <w:t>PRUEBAS DE FUNCIONALIDAD GUI</w:t>
+      </w:r>
+    </w:p>
+    <w:p>
+      <w:pPr>
+        <w:rPr>
+          <w:b/>
+          <w:bCs/>
+        </w:rPr>
+      </w:pPr>
+      <w:r>
+        <w:rPr>
+          <w:b/>
+          <w:bCs/>
+        </w:rPr>
+        <w:lastRenderedPageBreak/>
+        <w:drawing>
+          <wp:inline distT="0" distB="0" distL="0" distR="0" wp14:anchorId="5C190B81" wp14:editId="35B6101F">
+            <wp:extent cx="5612130" cy="2987040"/>
+            <wp:effectExtent l="0" t="0" r="7620" b="3810"/>
+            <wp:docPr id="1725918044" name="Imagen 1"/>
+            <wp:cNvGraphicFramePr>
+              <a:graphicFrameLocks xmlns:a="http://schemas.openxmlformats.org/drawingml/2006/main" noChangeAspect="1"/>
+            </wp:cNvGraphicFramePr>
+            <a:graphic xmlns:a="http://schemas.openxmlformats.org/drawingml/2006/main">
+              <a:graphicData uri="http://schemas.openxmlformats.org/drawingml/2006/picture">
+                <pic:pic xmlns:pic="http://schemas.openxmlformats.org/drawingml/2006/picture">
+                  <pic:nvPicPr>
+                    <pic:cNvPr id="1725918044" name=""/>
+                    <pic:cNvPicPr/>
+                  </pic:nvPicPr>
+                  <pic:blipFill>
+                    <a:blip r:embed="rId13"/>
+                    <a:stretch>
+                      <a:fillRect/>
+                    </a:stretch>
+                  </pic:blipFill>
+                  <pic:spPr>
+                    <a:xfrm>
+                      <a:off x="0" y="0"/>
+                      <a:ext cx="5612130" cy="2987040"/>
+                    </a:xfrm>
+                    <a:prstGeom prst="rect">
+                      <a:avLst/>
+                    </a:prstGeom>
+                  </pic:spPr>
+                </pic:pic>
+              </a:graphicData>
+            </a:graphic>
+          </wp:inline>
+        </w:drawing>
+      </w:r>
+    </w:p>
+    <w:p>
+      <w:pPr>
+        <w:rPr>
+          <w:b/>
+          <w:bCs/>
+        </w:rPr>
+      </w:pPr>
+    </w:p>
+    <w:p>
+      <w:pPr>
+        <w:rPr>
+          <w:b/>
+          <w:bCs/>
+        </w:rPr>
+      </w:pPr>
+      <w:r>
+        <w:rPr>
+          <w:b/>
+          <w:bCs/>
+        </w:rPr>
+        <w:drawing>
+          <wp:inline distT="0" distB="0" distL="0" distR="0" wp14:anchorId="196F7EB4" wp14:editId="511D95CB">
+            <wp:extent cx="5612130" cy="2955290"/>
+            <wp:effectExtent l="0" t="0" r="7620" b="0"/>
+            <wp:docPr id="1142108245" name="Imagen 1"/>
+            <wp:cNvGraphicFramePr>
+              <a:graphicFrameLocks xmlns:a="http://schemas.openxmlformats.org/drawingml/2006/main" noChangeAspect="1"/>
+            </wp:cNvGraphicFramePr>
+            <a:graphic xmlns:a="http://schemas.openxmlformats.org/drawingml/2006/main">
+              <a:graphicData uri="http://schemas.openxmlformats.org/drawingml/2006/picture">
+                <pic:pic xmlns:pic="http://schemas.openxmlformats.org/drawingml/2006/picture">
+                  <pic:nvPicPr>
+                    <pic:cNvPr id="1142108245" name=""/>
+                    <pic:cNvPicPr/>
+                  </pic:nvPicPr>
+                  <pic:blipFill>
+                    <a:blip r:embed="rId14"/>
+                    <a:stretch>
+                      <a:fillRect/>
+                    </a:stretch>
+                  </pic:blipFill>
+                  <pic:spPr>
+                    <a:xfrm>
+                      <a:off x="0" y="0"/>
+                      <a:ext cx="5612130" cy="2955290"/>
+                    </a:xfrm>
+                    <a:prstGeom prst="rect">
+                      <a:avLst/>
+                    </a:prstGeom>
+                  </pic:spPr>
+                </pic:pic>
+              </a:graphicData>
+            </a:graphic>
+          </wp:inline>
+        </w:drawing>
+      </w:r>
+    </w:p>
+    <w:p>
+      <w:pPr>
+        <w:rPr>
+          <w:b/>
+          <w:bCs/>
+        </w:rPr>
+      </w:pPr>
+      <w:r>
+        <w:rPr>
+          <w:b/>
+          <w:bCs/>
+        </w:rPr>
+        <w:t>Prueba de usuarios</w:t>
+      </w:r>
+    </w:p>
+    <w:p>
+      <w:pPr>
+        <w:rPr>
+          <w:b/>
+          <w:bCs/>
+        </w:rPr>
+      </w:pPr>
+    </w:p>
+    <w:p>
+      <w:pPr>
+        <w:rPr>
+          <w:b/>
+          <w:bCs/>
+        </w:rPr>
+      </w:pPr>
+    </w:p>
+    <w:p>
+      <w:pPr>
+        <w:rPr>
+          <w:b/>
+          <w:bCs/>
+        </w:rPr>
+      </w:pPr>
+    </w:p>
+    <w:p>
+      <w:pPr>
+        <w:rPr>
+          <w:b/>
+          <w:bCs/>
+        </w:rPr>
+      </w:pPr>
+    </w:p>
+    <w:p>
+      <w:pPr>
+        <w:rPr>
+          <w:b/>
+          <w:bCs/>
+        </w:rPr>
+      </w:pPr>
+      <w:r>
+        <w:rPr>
+          <w:b/>
+          <w:bCs/>
+        </w:rPr>
+        <w:lastRenderedPageBreak/>
+        <w:t>Prueba de categorias</w:t>
+      </w:r>
+    </w:p>
+    <w:p>
+      <w:pPr>
+        <w:rPr>
+          <w:b/>
+          <w:bCs/>
+        </w:rPr>
+      </w:pPr>
+      <w:r>
+        <w:rPr>
+          <w:b/>
+          <w:bCs/>
+        </w:rPr>
+        <w:drawing>
+          <wp:inline distT="0" distB="0" distL="0" distR="0" wp14:anchorId="416B8122" wp14:editId="2F601FFF">
+            <wp:extent cx="5612130" cy="2954655"/>
+            <wp:effectExtent l="0" t="0" r="7620" b="0"/>
+            <wp:docPr id="1775125867" name="Imagen 1"/>
+            <wp:cNvGraphicFramePr>
+              <a:graphicFrameLocks xmlns:a="http://schemas.openxmlformats.org/drawingml/2006/main" noChangeAspect="1"/>
+            </wp:cNvGraphicFramePr>
+            <a:graphic xmlns:a="http://schemas.openxmlformats.org/drawingml/2006/main">
+              <a:graphicData uri="http://schemas.openxmlformats.org/drawingml/2006/picture">
+                <pic:pic xmlns:pic="http://schemas.openxmlformats.org/drawingml/2006/picture">
+                  <pic:nvPicPr>
+                    <pic:cNvPr id="1775125867" name=""/>
+                    <pic:cNvPicPr/>
+                  </pic:nvPicPr>
+                  <pic:blipFill>
+                    <a:blip r:embed="rId15"/>
+                    <a:stretch>
+                      <a:fillRect/>
+                    </a:stretch>
+                  </pic:blipFill>
+                  <pic:spPr>
+                    <a:xfrm>
+                      <a:off x="0" y="0"/>
+                      <a:ext cx="5612130" cy="2954655"/>
+                    </a:xfrm>
+                    <a:prstGeom prst="rect">
+                      <a:avLst/>
+                    </a:prstGeom>
+                  </pic:spPr>
+                </pic:pic>
+              </a:graphicData>
+            </a:graphic>
+          </wp:inline>
+        </w:drawing>
+      </w:r>
+    </w:p>
+    <w:p>
+      <w:pPr>
+        <w:rPr>
+          <w:b/>
+          <w:bCs/>
+        </w:rPr>
+      </w:pPr>
+    </w:p>
+    <w:p>
+      <w:pPr>
+        <w:rPr>
+          <w:b/>
+          <w:bCs/>
+        </w:rPr>
+      </w:pPr>
+      <w:r>
+        <w:rPr>
+          <w:b/>
+          <w:bCs/>
+        </w:rPr>
+        <w:t>Prueba eventos</w:t>
+      </w:r>
+    </w:p>
+    <w:p>
+      <w:pPr>
+        <w:rPr>
+          <w:b/>
+          <w:bCs/>
+        </w:rPr>
+      </w:pPr>
+      <w:r>
+        <w:rPr>
+          <w:b/>
+          <w:bCs/>
+        </w:rPr>
+        <w:drawing>
+          <wp:inline distT="0" distB="0" distL="0" distR="0" wp14:anchorId="44DAE16B" wp14:editId="1A42F951">
+            <wp:extent cx="5612130" cy="2891155"/>
+            <wp:effectExtent l="0" t="0" r="7620" b="4445"/>
+            <wp:docPr id="397368196" name="Imagen 1"/>
+            <wp:cNvGraphicFramePr>
+              <a:graphicFrameLocks xmlns:a="http://schemas.openxmlformats.org/drawingml/2006/main" noChangeAspect="1"/>
+            </wp:cNvGraphicFramePr>
+            <a:graphic xmlns:a="http://schemas.openxmlformats.org/drawingml/2006/main">
+              <a:graphicData uri="http://schemas.openxmlformats.org/drawingml/2006/picture">
+                <pic:pic xmlns:pic="http://schemas.openxmlformats.org/drawingml/2006/picture">
+                  <pic:nvPicPr>
+                    <pic:cNvPr id="397368196" name=""/>
+                    <pic:cNvPicPr/>
+                  </pic:nvPicPr>
+                  <pic:blipFill>
+                    <a:blip r:embed="rId16"/>
+                    <a:stretch>
+                      <a:fillRect/>
+                    </a:stretch>
+                  </pic:blipFill>
+                  <pic:spPr>
+                    <a:xfrm>
+                      <a:off x="0" y="0"/>
+                      <a:ext cx="5612130" cy="2891155"/>
+                    </a:xfrm>
+                    <a:prstGeom prst="rect">
+                      <a:avLst/>
+                    </a:prstGeom>
+                  </pic:spPr>
+                </pic:pic>
+              </a:graphicData>
+            </a:graphic>
+          </wp:inline>
+        </w:drawing>
       </w:r>
     </w:p>
     <w:sectPr>

</xml_diff>